<commit_message>
Adicionado tipo no documento (fornecimento ou serviço)
</commit_message>
<xml_diff>
--- a/app/compras/templates_docs/CONFERENCIA_CD_COM_DISPUTA.docx
+++ b/app/compras/templates_docs/CONFERENCIA_CD_COM_DISPUTA.docx
@@ -6750,11 +6750,11 @@
         <w:tblLook w:val="04a0" w:noHBand="0" w:noVBand="1" w:firstColumn="1" w:lastRow="0" w:lastColumn="0" w:firstRow="1"/>
       </w:tblPr>
       <w:tblGrid>
-        <w:gridCol w:w="420"/>
-        <w:gridCol w:w="539"/>
+        <w:gridCol w:w="418"/>
+        <w:gridCol w:w="541"/>
         <w:gridCol w:w="5812"/>
-        <w:gridCol w:w="1689"/>
-        <w:gridCol w:w="1854"/>
+        <w:gridCol w:w="1687"/>
+        <w:gridCol w:w="1856"/>
       </w:tblGrid>
       <w:tr>
         <w:trPr>
@@ -6826,7 +6826,7 @@
         </w:tc>
         <w:tc>
           <w:tcPr>
-            <w:tcW w:w="1689" w:type="dxa"/>
+            <w:tcW w:w="1687" w:type="dxa"/>
             <w:tcBorders/>
             <w:vAlign w:val="center"/>
           </w:tcPr>
@@ -6860,7 +6860,7 @@
         </w:tc>
         <w:tc>
           <w:tcPr>
-            <w:tcW w:w="1854" w:type="dxa"/>
+            <w:tcW w:w="1856" w:type="dxa"/>
             <w:tcBorders/>
             <w:vAlign w:val="center"/>
           </w:tcPr>
@@ -6899,7 +6899,7 @@
         </w:trPr>
         <w:tc>
           <w:tcPr>
-            <w:tcW w:w="420" w:type="dxa"/>
+            <w:tcW w:w="418" w:type="dxa"/>
             <w:vMerge w:val="restart"/>
             <w:tcBorders/>
             <w:textDirection w:val="btLr"/>
@@ -6937,7 +6937,7 @@
         </w:tc>
         <w:tc>
           <w:tcPr>
-            <w:tcW w:w="6351" w:type="dxa"/>
+            <w:tcW w:w="6353" w:type="dxa"/>
             <w:gridSpan w:val="2"/>
             <w:tcBorders/>
             <w:vAlign w:val="center"/>
@@ -7014,7 +7014,7 @@
         </w:tc>
         <w:tc>
           <w:tcPr>
-            <w:tcW w:w="1689" w:type="dxa"/>
+            <w:tcW w:w="1687" w:type="dxa"/>
             <w:tcBorders/>
             <w:vAlign w:val="center"/>
           </w:tcPr>
@@ -7048,7 +7048,7 @@
         </w:tc>
         <w:tc>
           <w:tcPr>
-            <w:tcW w:w="1854" w:type="dxa"/>
+            <w:tcW w:w="1856" w:type="dxa"/>
             <w:tcBorders/>
             <w:vAlign w:val="center"/>
           </w:tcPr>
@@ -7087,7 +7087,7 @@
         </w:trPr>
         <w:tc>
           <w:tcPr>
-            <w:tcW w:w="420" w:type="dxa"/>
+            <w:tcW w:w="418" w:type="dxa"/>
             <w:vMerge w:val="continue"/>
             <w:tcBorders/>
           </w:tcPr>
@@ -7119,7 +7119,7 @@
         </w:tc>
         <w:tc>
           <w:tcPr>
-            <w:tcW w:w="6351" w:type="dxa"/>
+            <w:tcW w:w="6353" w:type="dxa"/>
             <w:gridSpan w:val="2"/>
             <w:tcBorders/>
             <w:vAlign w:val="center"/>
@@ -7155,7 +7155,7 @@
         </w:tc>
         <w:tc>
           <w:tcPr>
-            <w:tcW w:w="1689" w:type="dxa"/>
+            <w:tcW w:w="1687" w:type="dxa"/>
             <w:tcBorders/>
           </w:tcPr>
           <w:p>
@@ -7188,7 +7188,7 @@
         </w:tc>
         <w:tc>
           <w:tcPr>
-            <w:tcW w:w="1854" w:type="dxa"/>
+            <w:tcW w:w="1856" w:type="dxa"/>
             <w:tcBorders/>
           </w:tcPr>
           <w:p>
@@ -7226,7 +7226,7 @@
         </w:trPr>
         <w:tc>
           <w:tcPr>
-            <w:tcW w:w="420" w:type="dxa"/>
+            <w:tcW w:w="418" w:type="dxa"/>
             <w:vMerge w:val="continue"/>
             <w:tcBorders/>
           </w:tcPr>
@@ -7258,7 +7258,7 @@
         </w:tc>
         <w:tc>
           <w:tcPr>
-            <w:tcW w:w="6351" w:type="dxa"/>
+            <w:tcW w:w="6353" w:type="dxa"/>
             <w:gridSpan w:val="2"/>
             <w:tcBorders/>
             <w:vAlign w:val="center"/>
@@ -7294,7 +7294,7 @@
         </w:tc>
         <w:tc>
           <w:tcPr>
-            <w:tcW w:w="1689" w:type="dxa"/>
+            <w:tcW w:w="1687" w:type="dxa"/>
             <w:tcBorders/>
           </w:tcPr>
           <w:p>
@@ -7327,7 +7327,7 @@
         </w:tc>
         <w:tc>
           <w:tcPr>
-            <w:tcW w:w="1854" w:type="dxa"/>
+            <w:tcW w:w="1856" w:type="dxa"/>
             <w:tcBorders/>
           </w:tcPr>
           <w:p>
@@ -7365,7 +7365,7 @@
         </w:trPr>
         <w:tc>
           <w:tcPr>
-            <w:tcW w:w="420" w:type="dxa"/>
+            <w:tcW w:w="418" w:type="dxa"/>
             <w:vMerge w:val="continue"/>
             <w:tcBorders/>
           </w:tcPr>
@@ -7397,7 +7397,7 @@
         </w:tc>
         <w:tc>
           <w:tcPr>
-            <w:tcW w:w="6351" w:type="dxa"/>
+            <w:tcW w:w="6353" w:type="dxa"/>
             <w:gridSpan w:val="2"/>
             <w:tcBorders/>
             <w:vAlign w:val="center"/>
@@ -7489,7 +7489,7 @@
         </w:tc>
         <w:tc>
           <w:tcPr>
-            <w:tcW w:w="1689" w:type="dxa"/>
+            <w:tcW w:w="1687" w:type="dxa"/>
             <w:tcBorders/>
           </w:tcPr>
           <w:p>
@@ -7522,7 +7522,7 @@
         </w:tc>
         <w:tc>
           <w:tcPr>
-            <w:tcW w:w="1854" w:type="dxa"/>
+            <w:tcW w:w="1856" w:type="dxa"/>
             <w:tcBorders/>
           </w:tcPr>
           <w:p>
@@ -7560,7 +7560,7 @@
         </w:trPr>
         <w:tc>
           <w:tcPr>
-            <w:tcW w:w="420" w:type="dxa"/>
+            <w:tcW w:w="418" w:type="dxa"/>
             <w:vMerge w:val="continue"/>
             <w:tcBorders/>
           </w:tcPr>
@@ -7592,7 +7592,7 @@
         </w:tc>
         <w:tc>
           <w:tcPr>
-            <w:tcW w:w="6351" w:type="dxa"/>
+            <w:tcW w:w="6353" w:type="dxa"/>
             <w:gridSpan w:val="2"/>
             <w:tcBorders/>
             <w:vAlign w:val="center"/>
@@ -7628,7 +7628,7 @@
         </w:tc>
         <w:tc>
           <w:tcPr>
-            <w:tcW w:w="1689" w:type="dxa"/>
+            <w:tcW w:w="1687" w:type="dxa"/>
             <w:tcBorders/>
           </w:tcPr>
           <w:p>
@@ -7661,7 +7661,7 @@
         </w:tc>
         <w:tc>
           <w:tcPr>
-            <w:tcW w:w="1854" w:type="dxa"/>
+            <w:tcW w:w="1856" w:type="dxa"/>
             <w:tcBorders/>
           </w:tcPr>
           <w:p>
@@ -7699,7 +7699,7 @@
         </w:trPr>
         <w:tc>
           <w:tcPr>
-            <w:tcW w:w="420" w:type="dxa"/>
+            <w:tcW w:w="418" w:type="dxa"/>
             <w:vMerge w:val="continue"/>
             <w:tcBorders/>
           </w:tcPr>
@@ -7731,7 +7731,7 @@
         </w:tc>
         <w:tc>
           <w:tcPr>
-            <w:tcW w:w="6351" w:type="dxa"/>
+            <w:tcW w:w="6353" w:type="dxa"/>
             <w:gridSpan w:val="2"/>
             <w:tcBorders/>
             <w:vAlign w:val="center"/>
@@ -7767,7 +7767,7 @@
         </w:tc>
         <w:tc>
           <w:tcPr>
-            <w:tcW w:w="1689" w:type="dxa"/>
+            <w:tcW w:w="1687" w:type="dxa"/>
             <w:tcBorders/>
           </w:tcPr>
           <w:p>
@@ -7800,7 +7800,7 @@
         </w:tc>
         <w:tc>
           <w:tcPr>
-            <w:tcW w:w="1854" w:type="dxa"/>
+            <w:tcW w:w="1856" w:type="dxa"/>
             <w:tcBorders/>
           </w:tcPr>
           <w:p>
@@ -7838,7 +7838,7 @@
         </w:trPr>
         <w:tc>
           <w:tcPr>
-            <w:tcW w:w="420" w:type="dxa"/>
+            <w:tcW w:w="418" w:type="dxa"/>
             <w:vMerge w:val="continue"/>
             <w:tcBorders/>
           </w:tcPr>
@@ -7870,7 +7870,7 @@
         </w:tc>
         <w:tc>
           <w:tcPr>
-            <w:tcW w:w="6351" w:type="dxa"/>
+            <w:tcW w:w="6353" w:type="dxa"/>
             <w:gridSpan w:val="2"/>
             <w:tcBorders/>
             <w:vAlign w:val="center"/>
@@ -7906,7 +7906,7 @@
         </w:tc>
         <w:tc>
           <w:tcPr>
-            <w:tcW w:w="1689" w:type="dxa"/>
+            <w:tcW w:w="1687" w:type="dxa"/>
             <w:tcBorders/>
           </w:tcPr>
           <w:p>
@@ -7939,7 +7939,7 @@
         </w:tc>
         <w:tc>
           <w:tcPr>
-            <w:tcW w:w="1854" w:type="dxa"/>
+            <w:tcW w:w="1856" w:type="dxa"/>
             <w:tcBorders/>
           </w:tcPr>
           <w:p>
@@ -7977,7 +7977,7 @@
         </w:trPr>
         <w:tc>
           <w:tcPr>
-            <w:tcW w:w="420" w:type="dxa"/>
+            <w:tcW w:w="418" w:type="dxa"/>
             <w:vMerge w:val="restart"/>
             <w:tcBorders/>
             <w:textDirection w:val="btLr"/>
@@ -8014,7 +8014,7 @@
         </w:tc>
         <w:tc>
           <w:tcPr>
-            <w:tcW w:w="539" w:type="dxa"/>
+            <w:tcW w:w="541" w:type="dxa"/>
             <w:vMerge w:val="restart"/>
             <w:tcBorders/>
             <w:textDirection w:val="btLr"/>
@@ -8089,7 +8089,7 @@
         </w:tc>
         <w:tc>
           <w:tcPr>
-            <w:tcW w:w="1689" w:type="dxa"/>
+            <w:tcW w:w="1687" w:type="dxa"/>
             <w:tcBorders/>
           </w:tcPr>
           <w:p>
@@ -8122,7 +8122,7 @@
         </w:tc>
         <w:tc>
           <w:tcPr>
-            <w:tcW w:w="1854" w:type="dxa"/>
+            <w:tcW w:w="1856" w:type="dxa"/>
             <w:tcBorders/>
             <w:shd w:color="auto" w:fill="auto" w:val="clear"/>
           </w:tcPr>
@@ -8161,7 +8161,7 @@
         </w:trPr>
         <w:tc>
           <w:tcPr>
-            <w:tcW w:w="420" w:type="dxa"/>
+            <w:tcW w:w="418" w:type="dxa"/>
             <w:vMerge w:val="continue"/>
             <w:tcBorders/>
           </w:tcPr>
@@ -8193,7 +8193,7 @@
         </w:tc>
         <w:tc>
           <w:tcPr>
-            <w:tcW w:w="539" w:type="dxa"/>
+            <w:tcW w:w="541" w:type="dxa"/>
             <w:vMerge w:val="continue"/>
             <w:tcBorders/>
             <w:textDirection w:val="btLr"/>
@@ -8263,7 +8263,7 @@
         </w:tc>
         <w:tc>
           <w:tcPr>
-            <w:tcW w:w="1689" w:type="dxa"/>
+            <w:tcW w:w="1687" w:type="dxa"/>
             <w:tcBorders/>
           </w:tcPr>
           <w:p>
@@ -8294,7 +8294,7 @@
         </w:tc>
         <w:tc>
           <w:tcPr>
-            <w:tcW w:w="1854" w:type="dxa"/>
+            <w:tcW w:w="1856" w:type="dxa"/>
             <w:tcBorders/>
             <w:shd w:color="auto" w:fill="auto" w:val="clear"/>
           </w:tcPr>
@@ -8331,7 +8331,7 @@
         </w:trPr>
         <w:tc>
           <w:tcPr>
-            <w:tcW w:w="420" w:type="dxa"/>
+            <w:tcW w:w="418" w:type="dxa"/>
             <w:vMerge w:val="continue"/>
             <w:tcBorders/>
           </w:tcPr>
@@ -8363,7 +8363,7 @@
         </w:tc>
         <w:tc>
           <w:tcPr>
-            <w:tcW w:w="539" w:type="dxa"/>
+            <w:tcW w:w="541" w:type="dxa"/>
             <w:vMerge w:val="continue"/>
             <w:tcBorders/>
             <w:textDirection w:val="btLr"/>
@@ -8436,7 +8436,7 @@
         </w:tc>
         <w:tc>
           <w:tcPr>
-            <w:tcW w:w="1689" w:type="dxa"/>
+            <w:tcW w:w="1687" w:type="dxa"/>
             <w:tcBorders/>
           </w:tcPr>
           <w:p>
@@ -8469,7 +8469,7 @@
         </w:tc>
         <w:tc>
           <w:tcPr>
-            <w:tcW w:w="1854" w:type="dxa"/>
+            <w:tcW w:w="1856" w:type="dxa"/>
             <w:tcBorders/>
             <w:shd w:color="auto" w:fill="auto" w:val="clear"/>
           </w:tcPr>
@@ -8508,7 +8508,7 @@
         </w:trPr>
         <w:tc>
           <w:tcPr>
-            <w:tcW w:w="420" w:type="dxa"/>
+            <w:tcW w:w="418" w:type="dxa"/>
             <w:vMerge w:val="continue"/>
             <w:tcBorders/>
           </w:tcPr>
@@ -8540,7 +8540,7 @@
         </w:tc>
         <w:tc>
           <w:tcPr>
-            <w:tcW w:w="539" w:type="dxa"/>
+            <w:tcW w:w="541" w:type="dxa"/>
             <w:vMerge w:val="continue"/>
             <w:tcBorders/>
             <w:textDirection w:val="btLr"/>
@@ -8610,7 +8610,7 @@
         </w:tc>
         <w:tc>
           <w:tcPr>
-            <w:tcW w:w="1689" w:type="dxa"/>
+            <w:tcW w:w="1687" w:type="dxa"/>
             <w:tcBorders/>
           </w:tcPr>
           <w:p>
@@ -8643,7 +8643,7 @@
         </w:tc>
         <w:tc>
           <w:tcPr>
-            <w:tcW w:w="1854" w:type="dxa"/>
+            <w:tcW w:w="1856" w:type="dxa"/>
             <w:tcBorders/>
           </w:tcPr>
           <w:p>
@@ -8681,7 +8681,7 @@
         </w:trPr>
         <w:tc>
           <w:tcPr>
-            <w:tcW w:w="420" w:type="dxa"/>
+            <w:tcW w:w="418" w:type="dxa"/>
             <w:vMerge w:val="continue"/>
             <w:tcBorders/>
           </w:tcPr>
@@ -8713,7 +8713,7 @@
         </w:tc>
         <w:tc>
           <w:tcPr>
-            <w:tcW w:w="539" w:type="dxa"/>
+            <w:tcW w:w="541" w:type="dxa"/>
             <w:vMerge w:val="continue"/>
             <w:tcBorders/>
             <w:textDirection w:val="btLr"/>
@@ -8783,7 +8783,7 @@
         </w:tc>
         <w:tc>
           <w:tcPr>
-            <w:tcW w:w="1689" w:type="dxa"/>
+            <w:tcW w:w="1687" w:type="dxa"/>
             <w:tcBorders/>
           </w:tcPr>
           <w:p>
@@ -8816,7 +8816,7 @@
         </w:tc>
         <w:tc>
           <w:tcPr>
-            <w:tcW w:w="1854" w:type="dxa"/>
+            <w:tcW w:w="1856" w:type="dxa"/>
             <w:tcBorders/>
           </w:tcPr>
           <w:p>
@@ -8854,7 +8854,7 @@
         </w:trPr>
         <w:tc>
           <w:tcPr>
-            <w:tcW w:w="420" w:type="dxa"/>
+            <w:tcW w:w="418" w:type="dxa"/>
             <w:vMerge w:val="continue"/>
             <w:tcBorders/>
           </w:tcPr>
@@ -8886,7 +8886,7 @@
         </w:tc>
         <w:tc>
           <w:tcPr>
-            <w:tcW w:w="539" w:type="dxa"/>
+            <w:tcW w:w="541" w:type="dxa"/>
             <w:vMerge w:val="restart"/>
             <w:tcBorders/>
             <w:textDirection w:val="btLr"/>
@@ -8960,7 +8960,7 @@
         </w:tc>
         <w:tc>
           <w:tcPr>
-            <w:tcW w:w="1689" w:type="dxa"/>
+            <w:tcW w:w="1687" w:type="dxa"/>
             <w:tcBorders/>
           </w:tcPr>
           <w:p>
@@ -8993,7 +8993,7 @@
         </w:tc>
         <w:tc>
           <w:tcPr>
-            <w:tcW w:w="1854" w:type="dxa"/>
+            <w:tcW w:w="1856" w:type="dxa"/>
             <w:tcBorders/>
           </w:tcPr>
           <w:p>
@@ -9031,7 +9031,7 @@
         </w:trPr>
         <w:tc>
           <w:tcPr>
-            <w:tcW w:w="420" w:type="dxa"/>
+            <w:tcW w:w="418" w:type="dxa"/>
             <w:vMerge w:val="continue"/>
             <w:tcBorders/>
           </w:tcPr>
@@ -9063,7 +9063,7 @@
         </w:tc>
         <w:tc>
           <w:tcPr>
-            <w:tcW w:w="539" w:type="dxa"/>
+            <w:tcW w:w="541" w:type="dxa"/>
             <w:vMerge w:val="continue"/>
             <w:tcBorders/>
             <w:vAlign w:val="center"/>
@@ -9131,7 +9131,7 @@
         </w:tc>
         <w:tc>
           <w:tcPr>
-            <w:tcW w:w="1689" w:type="dxa"/>
+            <w:tcW w:w="1687" w:type="dxa"/>
             <w:tcBorders/>
           </w:tcPr>
           <w:p>
@@ -9164,7 +9164,7 @@
         </w:tc>
         <w:tc>
           <w:tcPr>
-            <w:tcW w:w="1854" w:type="dxa"/>
+            <w:tcW w:w="1856" w:type="dxa"/>
             <w:tcBorders/>
           </w:tcPr>
           <w:p>
@@ -9202,7 +9202,7 @@
         </w:trPr>
         <w:tc>
           <w:tcPr>
-            <w:tcW w:w="420" w:type="dxa"/>
+            <w:tcW w:w="418" w:type="dxa"/>
             <w:vMerge w:val="continue"/>
             <w:tcBorders/>
           </w:tcPr>
@@ -9234,7 +9234,7 @@
         </w:tc>
         <w:tc>
           <w:tcPr>
-            <w:tcW w:w="539" w:type="dxa"/>
+            <w:tcW w:w="541" w:type="dxa"/>
             <w:vMerge w:val="continue"/>
             <w:tcBorders/>
             <w:vAlign w:val="center"/>
@@ -9303,7 +9303,7 @@
         </w:tc>
         <w:tc>
           <w:tcPr>
-            <w:tcW w:w="1689" w:type="dxa"/>
+            <w:tcW w:w="1687" w:type="dxa"/>
             <w:tcBorders/>
           </w:tcPr>
           <w:p>
@@ -9338,7 +9338,7 @@
         </w:tc>
         <w:tc>
           <w:tcPr>
-            <w:tcW w:w="1854" w:type="dxa"/>
+            <w:tcW w:w="1856" w:type="dxa"/>
             <w:tcBorders/>
           </w:tcPr>
           <w:p>
@@ -9378,7 +9378,7 @@
         </w:trPr>
         <w:tc>
           <w:tcPr>
-            <w:tcW w:w="420" w:type="dxa"/>
+            <w:tcW w:w="418" w:type="dxa"/>
             <w:vMerge w:val="continue"/>
             <w:tcBorders/>
           </w:tcPr>
@@ -9412,7 +9412,7 @@
         </w:tc>
         <w:tc>
           <w:tcPr>
-            <w:tcW w:w="539" w:type="dxa"/>
+            <w:tcW w:w="541" w:type="dxa"/>
             <w:vMerge w:val="continue"/>
             <w:tcBorders/>
             <w:vAlign w:val="center"/>
@@ -9482,7 +9482,7 @@
         </w:tc>
         <w:tc>
           <w:tcPr>
-            <w:tcW w:w="1689" w:type="dxa"/>
+            <w:tcW w:w="1687" w:type="dxa"/>
             <w:tcBorders/>
           </w:tcPr>
           <w:p>
@@ -9515,7 +9515,7 @@
         </w:tc>
         <w:tc>
           <w:tcPr>
-            <w:tcW w:w="1854" w:type="dxa"/>
+            <w:tcW w:w="1856" w:type="dxa"/>
             <w:tcBorders/>
           </w:tcPr>
           <w:p>
@@ -9553,7 +9553,7 @@
         </w:trPr>
         <w:tc>
           <w:tcPr>
-            <w:tcW w:w="420" w:type="dxa"/>
+            <w:tcW w:w="418" w:type="dxa"/>
             <w:vMerge w:val="continue"/>
             <w:tcBorders/>
           </w:tcPr>
@@ -9585,7 +9585,7 @@
         </w:tc>
         <w:tc>
           <w:tcPr>
-            <w:tcW w:w="539" w:type="dxa"/>
+            <w:tcW w:w="541" w:type="dxa"/>
             <w:vMerge w:val="continue"/>
             <w:tcBorders/>
             <w:vAlign w:val="center"/>
@@ -9653,7 +9653,7 @@
         </w:tc>
         <w:tc>
           <w:tcPr>
-            <w:tcW w:w="1689" w:type="dxa"/>
+            <w:tcW w:w="1687" w:type="dxa"/>
             <w:tcBorders/>
           </w:tcPr>
           <w:p>
@@ -9686,7 +9686,7 @@
         </w:tc>
         <w:tc>
           <w:tcPr>
-            <w:tcW w:w="1854" w:type="dxa"/>
+            <w:tcW w:w="1856" w:type="dxa"/>
             <w:tcBorders/>
           </w:tcPr>
           <w:p>
@@ -9724,7 +9724,7 @@
         </w:trPr>
         <w:tc>
           <w:tcPr>
-            <w:tcW w:w="420" w:type="dxa"/>
+            <w:tcW w:w="418" w:type="dxa"/>
             <w:vMerge w:val="continue"/>
             <w:tcBorders/>
           </w:tcPr>
@@ -9756,7 +9756,7 @@
         </w:tc>
         <w:tc>
           <w:tcPr>
-            <w:tcW w:w="539" w:type="dxa"/>
+            <w:tcW w:w="541" w:type="dxa"/>
             <w:vMerge w:val="continue"/>
             <w:tcBorders/>
             <w:vAlign w:val="center"/>
@@ -9824,7 +9824,7 @@
         </w:tc>
         <w:tc>
           <w:tcPr>
-            <w:tcW w:w="1689" w:type="dxa"/>
+            <w:tcW w:w="1687" w:type="dxa"/>
             <w:tcBorders/>
           </w:tcPr>
           <w:p>
@@ -9857,7 +9857,7 @@
         </w:tc>
         <w:tc>
           <w:tcPr>
-            <w:tcW w:w="1854" w:type="dxa"/>
+            <w:tcW w:w="1856" w:type="dxa"/>
             <w:tcBorders/>
           </w:tcPr>
           <w:p>
@@ -9895,7 +9895,7 @@
         </w:trPr>
         <w:tc>
           <w:tcPr>
-            <w:tcW w:w="420" w:type="dxa"/>
+            <w:tcW w:w="418" w:type="dxa"/>
             <w:vMerge w:val="continue"/>
             <w:tcBorders/>
           </w:tcPr>
@@ -9927,7 +9927,7 @@
         </w:tc>
         <w:tc>
           <w:tcPr>
-            <w:tcW w:w="539" w:type="dxa"/>
+            <w:tcW w:w="541" w:type="dxa"/>
             <w:vMerge w:val="continue"/>
             <w:tcBorders/>
             <w:vAlign w:val="center"/>
@@ -9995,7 +9995,7 @@
         </w:tc>
         <w:tc>
           <w:tcPr>
-            <w:tcW w:w="1689" w:type="dxa"/>
+            <w:tcW w:w="1687" w:type="dxa"/>
             <w:tcBorders/>
             <w:shd w:color="auto" w:fill="auto" w:val="clear"/>
           </w:tcPr>
@@ -10029,7 +10029,7 @@
         </w:tc>
         <w:tc>
           <w:tcPr>
-            <w:tcW w:w="1854" w:type="dxa"/>
+            <w:tcW w:w="1856" w:type="dxa"/>
             <w:tcBorders/>
           </w:tcPr>
           <w:p>
@@ -10067,7 +10067,7 @@
         </w:trPr>
         <w:tc>
           <w:tcPr>
-            <w:tcW w:w="420" w:type="dxa"/>
+            <w:tcW w:w="418" w:type="dxa"/>
             <w:vMerge w:val="continue"/>
             <w:tcBorders/>
           </w:tcPr>
@@ -10099,7 +10099,7 @@
         </w:tc>
         <w:tc>
           <w:tcPr>
-            <w:tcW w:w="539" w:type="dxa"/>
+            <w:tcW w:w="541" w:type="dxa"/>
             <w:vMerge w:val="continue"/>
             <w:tcBorders/>
             <w:vAlign w:val="center"/>
@@ -10167,7 +10167,7 @@
         </w:tc>
         <w:tc>
           <w:tcPr>
-            <w:tcW w:w="1689" w:type="dxa"/>
+            <w:tcW w:w="1687" w:type="dxa"/>
             <w:tcBorders/>
             <w:shd w:color="auto" w:fill="auto" w:val="clear"/>
           </w:tcPr>
@@ -10201,7 +10201,7 @@
         </w:tc>
         <w:tc>
           <w:tcPr>
-            <w:tcW w:w="1854" w:type="dxa"/>
+            <w:tcW w:w="1856" w:type="dxa"/>
             <w:tcBorders/>
           </w:tcPr>
           <w:p>
@@ -10239,7 +10239,7 @@
         </w:trPr>
         <w:tc>
           <w:tcPr>
-            <w:tcW w:w="420" w:type="dxa"/>
+            <w:tcW w:w="418" w:type="dxa"/>
             <w:vMerge w:val="continue"/>
             <w:tcBorders/>
           </w:tcPr>
@@ -10273,7 +10273,7 @@
         </w:tc>
         <w:tc>
           <w:tcPr>
-            <w:tcW w:w="539" w:type="dxa"/>
+            <w:tcW w:w="541" w:type="dxa"/>
             <w:vMerge w:val="continue"/>
             <w:tcBorders/>
             <w:vAlign w:val="center"/>
@@ -10341,7 +10341,7 @@
         </w:tc>
         <w:tc>
           <w:tcPr>
-            <w:tcW w:w="1689" w:type="dxa"/>
+            <w:tcW w:w="1687" w:type="dxa"/>
             <w:tcBorders/>
             <w:shd w:color="auto" w:fill="auto" w:val="clear"/>
           </w:tcPr>
@@ -10375,7 +10375,7 @@
         </w:tc>
         <w:tc>
           <w:tcPr>
-            <w:tcW w:w="1854" w:type="dxa"/>
+            <w:tcW w:w="1856" w:type="dxa"/>
             <w:tcBorders/>
           </w:tcPr>
           <w:p>
@@ -10413,7 +10413,7 @@
         </w:trPr>
         <w:tc>
           <w:tcPr>
-            <w:tcW w:w="420" w:type="dxa"/>
+            <w:tcW w:w="418" w:type="dxa"/>
             <w:vMerge w:val="continue"/>
             <w:tcBorders/>
           </w:tcPr>
@@ -10447,7 +10447,7 @@
         </w:tc>
         <w:tc>
           <w:tcPr>
-            <w:tcW w:w="539" w:type="dxa"/>
+            <w:tcW w:w="541" w:type="dxa"/>
             <w:vMerge w:val="continue"/>
             <w:tcBorders/>
             <w:vAlign w:val="center"/>
@@ -10515,7 +10515,7 @@
         </w:tc>
         <w:tc>
           <w:tcPr>
-            <w:tcW w:w="1689" w:type="dxa"/>
+            <w:tcW w:w="1687" w:type="dxa"/>
             <w:tcBorders/>
             <w:shd w:color="auto" w:fill="auto" w:val="clear"/>
           </w:tcPr>
@@ -10549,7 +10549,7 @@
         </w:tc>
         <w:tc>
           <w:tcPr>
-            <w:tcW w:w="1854" w:type="dxa"/>
+            <w:tcW w:w="1856" w:type="dxa"/>
             <w:tcBorders/>
           </w:tcPr>
           <w:p>
@@ -10587,7 +10587,7 @@
         </w:trPr>
         <w:tc>
           <w:tcPr>
-            <w:tcW w:w="420" w:type="dxa"/>
+            <w:tcW w:w="418" w:type="dxa"/>
             <w:vMerge w:val="continue"/>
             <w:tcBorders/>
           </w:tcPr>
@@ -10621,7 +10621,7 @@
         </w:tc>
         <w:tc>
           <w:tcPr>
-            <w:tcW w:w="539" w:type="dxa"/>
+            <w:tcW w:w="541" w:type="dxa"/>
             <w:vMerge w:val="continue"/>
             <w:tcBorders/>
             <w:vAlign w:val="center"/>
@@ -10689,7 +10689,7 @@
         </w:tc>
         <w:tc>
           <w:tcPr>
-            <w:tcW w:w="1689" w:type="dxa"/>
+            <w:tcW w:w="1687" w:type="dxa"/>
             <w:tcBorders/>
             <w:shd w:color="auto" w:fill="auto" w:val="clear"/>
           </w:tcPr>
@@ -10723,7 +10723,7 @@
         </w:tc>
         <w:tc>
           <w:tcPr>
-            <w:tcW w:w="1854" w:type="dxa"/>
+            <w:tcW w:w="1856" w:type="dxa"/>
             <w:tcBorders/>
           </w:tcPr>
           <w:p>
@@ -10761,7 +10761,7 @@
         </w:trPr>
         <w:tc>
           <w:tcPr>
-            <w:tcW w:w="420" w:type="dxa"/>
+            <w:tcW w:w="418" w:type="dxa"/>
             <w:vMerge w:val="continue"/>
             <w:tcBorders/>
           </w:tcPr>
@@ -10795,7 +10795,7 @@
         </w:tc>
         <w:tc>
           <w:tcPr>
-            <w:tcW w:w="539" w:type="dxa"/>
+            <w:tcW w:w="541" w:type="dxa"/>
             <w:vMerge w:val="continue"/>
             <w:tcBorders/>
             <w:vAlign w:val="center"/>
@@ -10863,7 +10863,7 @@
         </w:tc>
         <w:tc>
           <w:tcPr>
-            <w:tcW w:w="1689" w:type="dxa"/>
+            <w:tcW w:w="1687" w:type="dxa"/>
             <w:tcBorders/>
             <w:shd w:color="auto" w:fill="auto" w:val="clear"/>
           </w:tcPr>
@@ -10897,7 +10897,7 @@
         </w:tc>
         <w:tc>
           <w:tcPr>
-            <w:tcW w:w="1854" w:type="dxa"/>
+            <w:tcW w:w="1856" w:type="dxa"/>
             <w:tcBorders/>
           </w:tcPr>
           <w:p>
@@ -10935,7 +10935,7 @@
         </w:trPr>
         <w:tc>
           <w:tcPr>
-            <w:tcW w:w="420" w:type="dxa"/>
+            <w:tcW w:w="418" w:type="dxa"/>
             <w:vMerge w:val="continue"/>
             <w:tcBorders/>
           </w:tcPr>
@@ -10969,7 +10969,7 @@
         </w:tc>
         <w:tc>
           <w:tcPr>
-            <w:tcW w:w="539" w:type="dxa"/>
+            <w:tcW w:w="541" w:type="dxa"/>
             <w:vMerge w:val="continue"/>
             <w:tcBorders/>
             <w:vAlign w:val="center"/>
@@ -11037,7 +11037,7 @@
         </w:tc>
         <w:tc>
           <w:tcPr>
-            <w:tcW w:w="1689" w:type="dxa"/>
+            <w:tcW w:w="1687" w:type="dxa"/>
             <w:tcBorders/>
             <w:shd w:color="auto" w:fill="auto" w:val="clear"/>
           </w:tcPr>
@@ -11071,7 +11071,7 @@
         </w:tc>
         <w:tc>
           <w:tcPr>
-            <w:tcW w:w="1854" w:type="dxa"/>
+            <w:tcW w:w="1856" w:type="dxa"/>
             <w:tcBorders/>
           </w:tcPr>
           <w:p>
@@ -11109,7 +11109,7 @@
         </w:trPr>
         <w:tc>
           <w:tcPr>
-            <w:tcW w:w="420" w:type="dxa"/>
+            <w:tcW w:w="418" w:type="dxa"/>
             <w:vMerge w:val="continue"/>
             <w:tcBorders/>
           </w:tcPr>
@@ -11143,7 +11143,7 @@
         </w:tc>
         <w:tc>
           <w:tcPr>
-            <w:tcW w:w="539" w:type="dxa"/>
+            <w:tcW w:w="541" w:type="dxa"/>
             <w:vMerge w:val="continue"/>
             <w:tcBorders/>
             <w:vAlign w:val="center"/>
@@ -11211,7 +11211,7 @@
         </w:tc>
         <w:tc>
           <w:tcPr>
-            <w:tcW w:w="1689" w:type="dxa"/>
+            <w:tcW w:w="1687" w:type="dxa"/>
             <w:tcBorders/>
             <w:shd w:color="auto" w:fill="auto" w:val="clear"/>
           </w:tcPr>
@@ -11245,7 +11245,7 @@
         </w:tc>
         <w:tc>
           <w:tcPr>
-            <w:tcW w:w="1854" w:type="dxa"/>
+            <w:tcW w:w="1856" w:type="dxa"/>
             <w:tcBorders/>
           </w:tcPr>
           <w:p>
@@ -11283,7 +11283,7 @@
         </w:trPr>
         <w:tc>
           <w:tcPr>
-            <w:tcW w:w="420" w:type="dxa"/>
+            <w:tcW w:w="418" w:type="dxa"/>
             <w:vMerge w:val="continue"/>
             <w:tcBorders/>
           </w:tcPr>
@@ -11317,7 +11317,7 @@
         </w:tc>
         <w:tc>
           <w:tcPr>
-            <w:tcW w:w="539" w:type="dxa"/>
+            <w:tcW w:w="541" w:type="dxa"/>
             <w:vMerge w:val="continue"/>
             <w:tcBorders/>
             <w:vAlign w:val="center"/>
@@ -11385,7 +11385,7 @@
         </w:tc>
         <w:tc>
           <w:tcPr>
-            <w:tcW w:w="1689" w:type="dxa"/>
+            <w:tcW w:w="1687" w:type="dxa"/>
             <w:tcBorders/>
             <w:shd w:color="auto" w:fill="auto" w:val="clear"/>
           </w:tcPr>
@@ -11419,7 +11419,7 @@
         </w:tc>
         <w:tc>
           <w:tcPr>
-            <w:tcW w:w="1854" w:type="dxa"/>
+            <w:tcW w:w="1856" w:type="dxa"/>
             <w:tcBorders/>
           </w:tcPr>
           <w:p>
@@ -11457,7 +11457,7 @@
         </w:trPr>
         <w:tc>
           <w:tcPr>
-            <w:tcW w:w="420" w:type="dxa"/>
+            <w:tcW w:w="418" w:type="dxa"/>
             <w:vMerge w:val="continue"/>
             <w:tcBorders/>
           </w:tcPr>
@@ -11491,7 +11491,7 @@
         </w:tc>
         <w:tc>
           <w:tcPr>
-            <w:tcW w:w="539" w:type="dxa"/>
+            <w:tcW w:w="541" w:type="dxa"/>
             <w:vMerge w:val="continue"/>
             <w:tcBorders/>
             <w:vAlign w:val="center"/>
@@ -11559,7 +11559,7 @@
         </w:tc>
         <w:tc>
           <w:tcPr>
-            <w:tcW w:w="1689" w:type="dxa"/>
+            <w:tcW w:w="1687" w:type="dxa"/>
             <w:tcBorders/>
             <w:shd w:color="auto" w:fill="auto" w:val="clear"/>
           </w:tcPr>
@@ -11593,7 +11593,7 @@
         </w:tc>
         <w:tc>
           <w:tcPr>
-            <w:tcW w:w="1854" w:type="dxa"/>
+            <w:tcW w:w="1856" w:type="dxa"/>
             <w:tcBorders/>
           </w:tcPr>
           <w:p>
@@ -11631,7 +11631,7 @@
         </w:trPr>
         <w:tc>
           <w:tcPr>
-            <w:tcW w:w="420" w:type="dxa"/>
+            <w:tcW w:w="418" w:type="dxa"/>
             <w:tcBorders/>
             <w:textDirection w:val="btLr"/>
           </w:tcPr>
@@ -11664,7 +11664,7 @@
         </w:tc>
         <w:tc>
           <w:tcPr>
-            <w:tcW w:w="6351" w:type="dxa"/>
+            <w:tcW w:w="6353" w:type="dxa"/>
             <w:gridSpan w:val="2"/>
             <w:tcBorders/>
             <w:vAlign w:val="center"/>
@@ -11714,7 +11714,7 @@
         </w:tc>
         <w:tc>
           <w:tcPr>
-            <w:tcW w:w="1689" w:type="dxa"/>
+            <w:tcW w:w="1687" w:type="dxa"/>
             <w:tcBorders/>
           </w:tcPr>
           <w:p>
@@ -11747,7 +11747,7 @@
         </w:tc>
         <w:tc>
           <w:tcPr>
-            <w:tcW w:w="1854" w:type="dxa"/>
+            <w:tcW w:w="1856" w:type="dxa"/>
             <w:tcBorders/>
           </w:tcPr>
           <w:p>
@@ -11785,7 +11785,7 @@
         </w:trPr>
         <w:tc>
           <w:tcPr>
-            <w:tcW w:w="420" w:type="dxa"/>
+            <w:tcW w:w="418" w:type="dxa"/>
             <w:vMerge w:val="restart"/>
             <w:tcBorders/>
             <w:textDirection w:val="btLr"/>
@@ -11823,7 +11823,7 @@
         </w:tc>
         <w:tc>
           <w:tcPr>
-            <w:tcW w:w="6351" w:type="dxa"/>
+            <w:tcW w:w="6353" w:type="dxa"/>
             <w:gridSpan w:val="2"/>
             <w:tcBorders/>
             <w:vAlign w:val="center"/>
@@ -11859,7 +11859,7 @@
         </w:tc>
         <w:tc>
           <w:tcPr>
-            <w:tcW w:w="1689" w:type="dxa"/>
+            <w:tcW w:w="1687" w:type="dxa"/>
             <w:tcBorders/>
           </w:tcPr>
           <w:p>
@@ -11892,7 +11892,7 @@
         </w:tc>
         <w:tc>
           <w:tcPr>
-            <w:tcW w:w="1854" w:type="dxa"/>
+            <w:tcW w:w="1856" w:type="dxa"/>
             <w:tcBorders/>
           </w:tcPr>
           <w:p>
@@ -11930,7 +11930,7 @@
         </w:trPr>
         <w:tc>
           <w:tcPr>
-            <w:tcW w:w="420" w:type="dxa"/>
+            <w:tcW w:w="418" w:type="dxa"/>
             <w:vMerge w:val="continue"/>
             <w:tcBorders/>
           </w:tcPr>
@@ -11964,7 +11964,7 @@
         </w:tc>
         <w:tc>
           <w:tcPr>
-            <w:tcW w:w="6351" w:type="dxa"/>
+            <w:tcW w:w="6353" w:type="dxa"/>
             <w:gridSpan w:val="2"/>
             <w:tcBorders/>
             <w:vAlign w:val="center"/>
@@ -12000,7 +12000,7 @@
         </w:tc>
         <w:tc>
           <w:tcPr>
-            <w:tcW w:w="1689" w:type="dxa"/>
+            <w:tcW w:w="1687" w:type="dxa"/>
             <w:tcBorders/>
           </w:tcPr>
           <w:p>
@@ -12033,7 +12033,7 @@
         </w:tc>
         <w:tc>
           <w:tcPr>
-            <w:tcW w:w="1854" w:type="dxa"/>
+            <w:tcW w:w="1856" w:type="dxa"/>
             <w:tcBorders/>
           </w:tcPr>
           <w:p>
@@ -12071,7 +12071,7 @@
         </w:trPr>
         <w:tc>
           <w:tcPr>
-            <w:tcW w:w="420" w:type="dxa"/>
+            <w:tcW w:w="418" w:type="dxa"/>
             <w:vMerge w:val="continue"/>
             <w:tcBorders/>
           </w:tcPr>
@@ -12105,7 +12105,7 @@
         </w:tc>
         <w:tc>
           <w:tcPr>
-            <w:tcW w:w="6351" w:type="dxa"/>
+            <w:tcW w:w="6353" w:type="dxa"/>
             <w:gridSpan w:val="2"/>
             <w:tcBorders/>
             <w:vAlign w:val="center"/>
@@ -12141,7 +12141,7 @@
         </w:tc>
         <w:tc>
           <w:tcPr>
-            <w:tcW w:w="1689" w:type="dxa"/>
+            <w:tcW w:w="1687" w:type="dxa"/>
             <w:tcBorders/>
           </w:tcPr>
           <w:p>
@@ -12174,7 +12174,7 @@
         </w:tc>
         <w:tc>
           <w:tcPr>
-            <w:tcW w:w="1854" w:type="dxa"/>
+            <w:tcW w:w="1856" w:type="dxa"/>
             <w:tcBorders/>
           </w:tcPr>
           <w:p>
@@ -12212,7 +12212,7 @@
         </w:trPr>
         <w:tc>
           <w:tcPr>
-            <w:tcW w:w="420" w:type="dxa"/>
+            <w:tcW w:w="418" w:type="dxa"/>
             <w:vMerge w:val="continue"/>
             <w:tcBorders/>
           </w:tcPr>
@@ -12246,7 +12246,7 @@
         </w:tc>
         <w:tc>
           <w:tcPr>
-            <w:tcW w:w="6351" w:type="dxa"/>
+            <w:tcW w:w="6353" w:type="dxa"/>
             <w:gridSpan w:val="2"/>
             <w:tcBorders/>
             <w:vAlign w:val="center"/>
@@ -12282,7 +12282,7 @@
         </w:tc>
         <w:tc>
           <w:tcPr>
-            <w:tcW w:w="1689" w:type="dxa"/>
+            <w:tcW w:w="1687" w:type="dxa"/>
             <w:tcBorders/>
           </w:tcPr>
           <w:p>
@@ -12315,7 +12315,7 @@
         </w:tc>
         <w:tc>
           <w:tcPr>
-            <w:tcW w:w="1854" w:type="dxa"/>
+            <w:tcW w:w="1856" w:type="dxa"/>
             <w:tcBorders/>
           </w:tcPr>
           <w:p>
@@ -12353,7 +12353,7 @@
         </w:trPr>
         <w:tc>
           <w:tcPr>
-            <w:tcW w:w="420" w:type="dxa"/>
+            <w:tcW w:w="418" w:type="dxa"/>
             <w:vMerge w:val="continue"/>
             <w:tcBorders/>
           </w:tcPr>
@@ -12387,7 +12387,7 @@
         </w:tc>
         <w:tc>
           <w:tcPr>
-            <w:tcW w:w="6351" w:type="dxa"/>
+            <w:tcW w:w="6353" w:type="dxa"/>
             <w:gridSpan w:val="2"/>
             <w:tcBorders/>
             <w:vAlign w:val="center"/>
@@ -12423,7 +12423,7 @@
         </w:tc>
         <w:tc>
           <w:tcPr>
-            <w:tcW w:w="1689" w:type="dxa"/>
+            <w:tcW w:w="1687" w:type="dxa"/>
             <w:tcBorders/>
           </w:tcPr>
           <w:p>
@@ -12456,7 +12456,7 @@
         </w:tc>
         <w:tc>
           <w:tcPr>
-            <w:tcW w:w="1854" w:type="dxa"/>
+            <w:tcW w:w="1856" w:type="dxa"/>
             <w:tcBorders/>
           </w:tcPr>
           <w:p>
@@ -12494,7 +12494,7 @@
         </w:trPr>
         <w:tc>
           <w:tcPr>
-            <w:tcW w:w="420" w:type="dxa"/>
+            <w:tcW w:w="418" w:type="dxa"/>
             <w:vMerge w:val="continue"/>
             <w:tcBorders/>
           </w:tcPr>
@@ -12528,7 +12528,7 @@
         </w:tc>
         <w:tc>
           <w:tcPr>
-            <w:tcW w:w="6351" w:type="dxa"/>
+            <w:tcW w:w="6353" w:type="dxa"/>
             <w:gridSpan w:val="2"/>
             <w:tcBorders/>
             <w:vAlign w:val="center"/>
@@ -12565,7 +12565,7 @@
         </w:tc>
         <w:tc>
           <w:tcPr>
-            <w:tcW w:w="1689" w:type="dxa"/>
+            <w:tcW w:w="1687" w:type="dxa"/>
             <w:tcBorders/>
           </w:tcPr>
           <w:p>
@@ -12598,7 +12598,7 @@
         </w:tc>
         <w:tc>
           <w:tcPr>
-            <w:tcW w:w="1854" w:type="dxa"/>
+            <w:tcW w:w="1856" w:type="dxa"/>
             <w:tcBorders/>
           </w:tcPr>
           <w:p>
@@ -12636,7 +12636,7 @@
         </w:trPr>
         <w:tc>
           <w:tcPr>
-            <w:tcW w:w="420" w:type="dxa"/>
+            <w:tcW w:w="418" w:type="dxa"/>
             <w:vMerge w:val="continue"/>
             <w:tcBorders/>
           </w:tcPr>
@@ -12670,7 +12670,7 @@
         </w:tc>
         <w:tc>
           <w:tcPr>
-            <w:tcW w:w="6351" w:type="dxa"/>
+            <w:tcW w:w="6353" w:type="dxa"/>
             <w:gridSpan w:val="2"/>
             <w:tcBorders/>
             <w:vAlign w:val="center"/>
@@ -12707,7 +12707,7 @@
         </w:tc>
         <w:tc>
           <w:tcPr>
-            <w:tcW w:w="1689" w:type="dxa"/>
+            <w:tcW w:w="1687" w:type="dxa"/>
             <w:tcBorders/>
           </w:tcPr>
           <w:p>
@@ -12740,7 +12740,7 @@
         </w:tc>
         <w:tc>
           <w:tcPr>
-            <w:tcW w:w="1854" w:type="dxa"/>
+            <w:tcW w:w="1856" w:type="dxa"/>
             <w:tcBorders/>
           </w:tcPr>
           <w:p>
@@ -12778,7 +12778,7 @@
         </w:trPr>
         <w:tc>
           <w:tcPr>
-            <w:tcW w:w="420" w:type="dxa"/>
+            <w:tcW w:w="418" w:type="dxa"/>
             <w:vMerge w:val="continue"/>
             <w:tcBorders/>
           </w:tcPr>
@@ -12812,7 +12812,7 @@
         </w:tc>
         <w:tc>
           <w:tcPr>
-            <w:tcW w:w="6351" w:type="dxa"/>
+            <w:tcW w:w="6353" w:type="dxa"/>
             <w:gridSpan w:val="2"/>
             <w:tcBorders/>
             <w:vAlign w:val="center"/>
@@ -12845,7 +12845,7 @@
         </w:tc>
         <w:tc>
           <w:tcPr>
-            <w:tcW w:w="1689" w:type="dxa"/>
+            <w:tcW w:w="1687" w:type="dxa"/>
             <w:tcBorders/>
           </w:tcPr>
           <w:p>
@@ -12878,7 +12878,7 @@
         </w:tc>
         <w:tc>
           <w:tcPr>
-            <w:tcW w:w="1854" w:type="dxa"/>
+            <w:tcW w:w="1856" w:type="dxa"/>
             <w:tcBorders/>
           </w:tcPr>
           <w:p>
@@ -13107,6 +13107,25 @@
                 <w:szCs w:val="16"/>
               </w:rPr>
               <w:t>{{ modalidade }}</w:t>
+            </w:r>
+          </w:p>
+          <w:p>
+            <w:pPr>
+              <w:pStyle w:val="Contedodatabela"/>
+              <w:widowControl/>
+              <w:spacing w:lineRule="auto" w:line="331" w:before="0" w:after="0"/>
+              <w:rPr>
+                <w:color w:val="FF0000"/>
+              </w:rPr>
+            </w:pPr>
+            <w:r>
+              <w:rPr>
+                <w:rFonts w:cs="CenturyGothic,Bold" w:ascii="Arial;sans-serif" w:hAnsi="Arial;sans-serif"/>
+                <w:bCs/>
+                <w:color w:val="FF0000"/>
+                <w:szCs w:val="16"/>
+              </w:rPr>
+              <w:t>{{ tipo }}</w:t>
             </w:r>
           </w:p>
         </w:tc>
@@ -14243,11 +14262,11 @@
         <w:gridCol w:w="1299"/>
         <w:gridCol w:w="652"/>
         <w:gridCol w:w="666"/>
-        <w:gridCol w:w="1315"/>
-        <w:gridCol w:w="3255"/>
-        <w:gridCol w:w="1955"/>
-        <w:gridCol w:w="558"/>
-        <w:gridCol w:w="259"/>
+        <w:gridCol w:w="1316"/>
+        <w:gridCol w:w="3254"/>
+        <w:gridCol w:w="1959"/>
+        <w:gridCol w:w="557"/>
+        <w:gridCol w:w="256"/>
       </w:tblGrid>
       <w:tr>
         <w:trPr/>
@@ -14407,7 +14426,7 @@
         </w:tc>
         <w:tc>
           <w:tcPr>
-            <w:tcW w:w="1315" w:type="dxa"/>
+            <w:tcW w:w="1316" w:type="dxa"/>
             <w:tcBorders>
               <w:top w:val="single" w:sz="8" w:space="0" w:color="000000"/>
               <w:left w:val="single" w:sz="8" w:space="0" w:color="000000"/>
@@ -14446,7 +14465,7 @@
         </w:tc>
         <w:tc>
           <w:tcPr>
-            <w:tcW w:w="3255" w:type="dxa"/>
+            <w:tcW w:w="3254" w:type="dxa"/>
             <w:tcBorders>
               <w:top w:val="single" w:sz="8" w:space="0" w:color="000000"/>
               <w:left w:val="single" w:sz="8" w:space="0" w:color="000000"/>
@@ -14484,7 +14503,7 @@
         </w:tc>
         <w:tc>
           <w:tcPr>
-            <w:tcW w:w="1955" w:type="dxa"/>
+            <w:tcW w:w="1959" w:type="dxa"/>
             <w:tcBorders>
               <w:top w:val="single" w:sz="8" w:space="0" w:color="000000"/>
               <w:left w:val="single" w:sz="8" w:space="0" w:color="000000"/>
@@ -14522,7 +14541,7 @@
         </w:tc>
         <w:tc>
           <w:tcPr>
-            <w:tcW w:w="558" w:type="dxa"/>
+            <w:tcW w:w="557" w:type="dxa"/>
             <w:tcBorders>
               <w:top w:val="single" w:sz="8" w:space="0" w:color="000000"/>
               <w:left w:val="single" w:sz="8" w:space="0" w:color="000000"/>
@@ -14560,7 +14579,7 @@
         </w:tc>
         <w:tc>
           <w:tcPr>
-            <w:tcW w:w="259" w:type="dxa"/>
+            <w:tcW w:w="256" w:type="dxa"/>
             <w:tcBorders>
               <w:top w:val="single" w:sz="8" w:space="0" w:color="000000"/>
               <w:left w:val="single" w:sz="8" w:space="0" w:color="000000"/>
@@ -14747,7 +14766,7 @@
         </w:tc>
         <w:tc>
           <w:tcPr>
-            <w:tcW w:w="1315" w:type="dxa"/>
+            <w:tcW w:w="1316" w:type="dxa"/>
             <w:tcBorders>
               <w:top w:val="single" w:sz="8" w:space="0" w:color="000000"/>
               <w:left w:val="single" w:sz="8" w:space="0" w:color="000000"/>
@@ -14784,7 +14803,7 @@
         </w:tc>
         <w:tc>
           <w:tcPr>
-            <w:tcW w:w="3255" w:type="dxa"/>
+            <w:tcW w:w="3254" w:type="dxa"/>
             <w:tcBorders>
               <w:top w:val="single" w:sz="8" w:space="0" w:color="000000"/>
               <w:left w:val="single" w:sz="8" w:space="0" w:color="000000"/>
@@ -14831,7 +14850,7 @@
         </w:tc>
         <w:tc>
           <w:tcPr>
-            <w:tcW w:w="1955" w:type="dxa"/>
+            <w:tcW w:w="1959" w:type="dxa"/>
             <w:tcBorders>
               <w:top w:val="single" w:sz="8" w:space="0" w:color="000000"/>
               <w:left w:val="single" w:sz="8" w:space="0" w:color="000000"/>
@@ -14868,7 +14887,7 @@
         </w:tc>
         <w:tc>
           <w:tcPr>
-            <w:tcW w:w="558" w:type="dxa"/>
+            <w:tcW w:w="557" w:type="dxa"/>
             <w:tcBorders>
               <w:top w:val="single" w:sz="8" w:space="0" w:color="000000"/>
               <w:left w:val="single" w:sz="8" w:space="0" w:color="000000"/>
@@ -14890,7 +14909,7 @@
         </w:tc>
         <w:tc>
           <w:tcPr>
-            <w:tcW w:w="259" w:type="dxa"/>
+            <w:tcW w:w="256" w:type="dxa"/>
             <w:tcBorders>
               <w:top w:val="single" w:sz="8" w:space="0" w:color="000000"/>
               <w:left w:val="single" w:sz="8" w:space="0" w:color="000000"/>

</xml_diff>

<commit_message>
uniformizado centro de despesa para centro gerencial
</commit_message>
<xml_diff>
--- a/app/compras/templates_docs/CONFERENCIA_CD_COM_DISPUTA.docx
+++ b/app/compras/templates_docs/CONFERENCIA_CD_COM_DISPUTA.docx
@@ -10132,7 +10132,29 @@
                 <w:sz w:val="16"/>
                 <w:szCs w:val="16"/>
               </w:rPr>
-              <w:t>Centro de despesa</w:t>
+              <w:t xml:space="preserve">Centro </w:t>
+            </w:r>
+            <w:r>
+              <w:rPr>
+                <w:rFonts w:cs="CenturyGothic,Bold"/>
+                <w:b/>
+                <w:bCs/>
+                <w:color w:val="000000"/>
+                <w:sz w:val="16"/>
+                <w:szCs w:val="16"/>
+              </w:rPr>
+              <w:t>Gerencial</w:t>
+            </w:r>
+            <w:r>
+              <w:rPr>
+                <w:rFonts w:cs="CenturyGothic,Bold"/>
+                <w:b/>
+                <w:bCs/>
+                <w:color w:val="000000"/>
+                <w:sz w:val="16"/>
+                <w:szCs w:val="16"/>
+              </w:rPr>
+              <w:t xml:space="preserve"> </w:t>
             </w:r>
             <w:r>
               <w:rPr>
@@ -10563,7 +10585,16 @@
                 <w:sz w:val="16"/>
                 <w:szCs w:val="16"/>
               </w:rPr>
-              <w:t>.centro_despesa</w:t>
+              <w:t>.centro_</w:t>
+            </w:r>
+            <w:r>
+              <w:rPr>
+                <w:rFonts w:cs="CenturyGothic,Bold"/>
+                <w:bCs/>
+                <w:sz w:val="16"/>
+                <w:szCs w:val="16"/>
+              </w:rPr>
+              <w:t>gerencial</w:t>
             </w:r>
             <w:proofErr w:type="spellEnd"/>
             <w:r>

</xml_diff>

<commit_message>
incluido valor do item no documento de conferencia
</commit_message>
<xml_diff>
--- a/app/compras/templates_docs/CONFERENCIA_CD_COM_DISPUTA.docx
+++ b/app/compras/templates_docs/CONFERENCIA_CD_COM_DISPUTA.docx
@@ -6750,8 +6750,8 @@
         <w:tblLook w:val="04a0" w:noHBand="0" w:noVBand="1" w:firstColumn="1" w:lastRow="0" w:lastColumn="0" w:firstRow="1"/>
       </w:tblPr>
       <w:tblGrid>
-        <w:gridCol w:w="416"/>
-        <w:gridCol w:w="543"/>
+        <w:gridCol w:w="412"/>
+        <w:gridCol w:w="547"/>
         <w:gridCol w:w="5812"/>
         <w:gridCol w:w="1687"/>
         <w:gridCol w:w="1856"/>
@@ -6899,7 +6899,7 @@
         </w:trPr>
         <w:tc>
           <w:tcPr>
-            <w:tcW w:w="416" w:type="dxa"/>
+            <w:tcW w:w="412" w:type="dxa"/>
             <w:vMerge w:val="restart"/>
             <w:tcBorders/>
             <w:textDirection w:val="btLr"/>
@@ -6937,7 +6937,7 @@
         </w:tc>
         <w:tc>
           <w:tcPr>
-            <w:tcW w:w="6355" w:type="dxa"/>
+            <w:tcW w:w="6359" w:type="dxa"/>
             <w:gridSpan w:val="2"/>
             <w:tcBorders/>
             <w:vAlign w:val="center"/>
@@ -7087,7 +7087,7 @@
         </w:trPr>
         <w:tc>
           <w:tcPr>
-            <w:tcW w:w="416" w:type="dxa"/>
+            <w:tcW w:w="412" w:type="dxa"/>
             <w:vMerge w:val="continue"/>
             <w:tcBorders/>
           </w:tcPr>
@@ -7119,7 +7119,7 @@
         </w:tc>
         <w:tc>
           <w:tcPr>
-            <w:tcW w:w="6355" w:type="dxa"/>
+            <w:tcW w:w="6359" w:type="dxa"/>
             <w:gridSpan w:val="2"/>
             <w:tcBorders/>
             <w:vAlign w:val="center"/>
@@ -7226,7 +7226,7 @@
         </w:trPr>
         <w:tc>
           <w:tcPr>
-            <w:tcW w:w="416" w:type="dxa"/>
+            <w:tcW w:w="412" w:type="dxa"/>
             <w:vMerge w:val="continue"/>
             <w:tcBorders/>
           </w:tcPr>
@@ -7258,7 +7258,7 @@
         </w:tc>
         <w:tc>
           <w:tcPr>
-            <w:tcW w:w="6355" w:type="dxa"/>
+            <w:tcW w:w="6359" w:type="dxa"/>
             <w:gridSpan w:val="2"/>
             <w:tcBorders/>
             <w:vAlign w:val="center"/>
@@ -7365,7 +7365,7 @@
         </w:trPr>
         <w:tc>
           <w:tcPr>
-            <w:tcW w:w="416" w:type="dxa"/>
+            <w:tcW w:w="412" w:type="dxa"/>
             <w:vMerge w:val="continue"/>
             <w:tcBorders/>
           </w:tcPr>
@@ -7397,7 +7397,7 @@
         </w:tc>
         <w:tc>
           <w:tcPr>
-            <w:tcW w:w="6355" w:type="dxa"/>
+            <w:tcW w:w="6359" w:type="dxa"/>
             <w:gridSpan w:val="2"/>
             <w:tcBorders/>
             <w:vAlign w:val="center"/>
@@ -7560,7 +7560,7 @@
         </w:trPr>
         <w:tc>
           <w:tcPr>
-            <w:tcW w:w="416" w:type="dxa"/>
+            <w:tcW w:w="412" w:type="dxa"/>
             <w:vMerge w:val="continue"/>
             <w:tcBorders/>
           </w:tcPr>
@@ -7592,7 +7592,7 @@
         </w:tc>
         <w:tc>
           <w:tcPr>
-            <w:tcW w:w="6355" w:type="dxa"/>
+            <w:tcW w:w="6359" w:type="dxa"/>
             <w:gridSpan w:val="2"/>
             <w:tcBorders/>
             <w:vAlign w:val="center"/>
@@ -7699,7 +7699,7 @@
         </w:trPr>
         <w:tc>
           <w:tcPr>
-            <w:tcW w:w="416" w:type="dxa"/>
+            <w:tcW w:w="412" w:type="dxa"/>
             <w:vMerge w:val="continue"/>
             <w:tcBorders/>
           </w:tcPr>
@@ -7731,7 +7731,7 @@
         </w:tc>
         <w:tc>
           <w:tcPr>
-            <w:tcW w:w="6355" w:type="dxa"/>
+            <w:tcW w:w="6359" w:type="dxa"/>
             <w:gridSpan w:val="2"/>
             <w:tcBorders/>
             <w:vAlign w:val="center"/>
@@ -7838,7 +7838,7 @@
         </w:trPr>
         <w:tc>
           <w:tcPr>
-            <w:tcW w:w="416" w:type="dxa"/>
+            <w:tcW w:w="412" w:type="dxa"/>
             <w:vMerge w:val="continue"/>
             <w:tcBorders/>
           </w:tcPr>
@@ -7870,7 +7870,7 @@
         </w:tc>
         <w:tc>
           <w:tcPr>
-            <w:tcW w:w="6355" w:type="dxa"/>
+            <w:tcW w:w="6359" w:type="dxa"/>
             <w:gridSpan w:val="2"/>
             <w:tcBorders/>
             <w:vAlign w:val="center"/>
@@ -7977,7 +7977,7 @@
         </w:trPr>
         <w:tc>
           <w:tcPr>
-            <w:tcW w:w="416" w:type="dxa"/>
+            <w:tcW w:w="412" w:type="dxa"/>
             <w:vMerge w:val="restart"/>
             <w:tcBorders/>
             <w:textDirection w:val="btLr"/>
@@ -8014,7 +8014,7 @@
         </w:tc>
         <w:tc>
           <w:tcPr>
-            <w:tcW w:w="543" w:type="dxa"/>
+            <w:tcW w:w="547" w:type="dxa"/>
             <w:vMerge w:val="restart"/>
             <w:tcBorders/>
             <w:textDirection w:val="btLr"/>
@@ -8161,7 +8161,7 @@
         </w:trPr>
         <w:tc>
           <w:tcPr>
-            <w:tcW w:w="416" w:type="dxa"/>
+            <w:tcW w:w="412" w:type="dxa"/>
             <w:vMerge w:val="continue"/>
             <w:tcBorders/>
           </w:tcPr>
@@ -8193,7 +8193,7 @@
         </w:tc>
         <w:tc>
           <w:tcPr>
-            <w:tcW w:w="543" w:type="dxa"/>
+            <w:tcW w:w="547" w:type="dxa"/>
             <w:vMerge w:val="continue"/>
             <w:tcBorders/>
             <w:textDirection w:val="btLr"/>
@@ -8331,7 +8331,7 @@
         </w:trPr>
         <w:tc>
           <w:tcPr>
-            <w:tcW w:w="416" w:type="dxa"/>
+            <w:tcW w:w="412" w:type="dxa"/>
             <w:vMerge w:val="continue"/>
             <w:tcBorders/>
           </w:tcPr>
@@ -8363,7 +8363,7 @@
         </w:tc>
         <w:tc>
           <w:tcPr>
-            <w:tcW w:w="543" w:type="dxa"/>
+            <w:tcW w:w="547" w:type="dxa"/>
             <w:vMerge w:val="continue"/>
             <w:tcBorders/>
             <w:textDirection w:val="btLr"/>
@@ -8508,7 +8508,7 @@
         </w:trPr>
         <w:tc>
           <w:tcPr>
-            <w:tcW w:w="416" w:type="dxa"/>
+            <w:tcW w:w="412" w:type="dxa"/>
             <w:vMerge w:val="continue"/>
             <w:tcBorders/>
           </w:tcPr>
@@ -8540,7 +8540,7 @@
         </w:tc>
         <w:tc>
           <w:tcPr>
-            <w:tcW w:w="543" w:type="dxa"/>
+            <w:tcW w:w="547" w:type="dxa"/>
             <w:vMerge w:val="continue"/>
             <w:tcBorders/>
             <w:textDirection w:val="btLr"/>
@@ -8681,7 +8681,7 @@
         </w:trPr>
         <w:tc>
           <w:tcPr>
-            <w:tcW w:w="416" w:type="dxa"/>
+            <w:tcW w:w="412" w:type="dxa"/>
             <w:vMerge w:val="continue"/>
             <w:tcBorders/>
           </w:tcPr>
@@ -8713,7 +8713,7 @@
         </w:tc>
         <w:tc>
           <w:tcPr>
-            <w:tcW w:w="543" w:type="dxa"/>
+            <w:tcW w:w="547" w:type="dxa"/>
             <w:vMerge w:val="continue"/>
             <w:tcBorders/>
             <w:textDirection w:val="btLr"/>
@@ -8854,7 +8854,7 @@
         </w:trPr>
         <w:tc>
           <w:tcPr>
-            <w:tcW w:w="416" w:type="dxa"/>
+            <w:tcW w:w="412" w:type="dxa"/>
             <w:vMerge w:val="continue"/>
             <w:tcBorders/>
           </w:tcPr>
@@ -8886,7 +8886,7 @@
         </w:tc>
         <w:tc>
           <w:tcPr>
-            <w:tcW w:w="543" w:type="dxa"/>
+            <w:tcW w:w="547" w:type="dxa"/>
             <w:vMerge w:val="restart"/>
             <w:tcBorders/>
             <w:textDirection w:val="btLr"/>
@@ -9031,7 +9031,7 @@
         </w:trPr>
         <w:tc>
           <w:tcPr>
-            <w:tcW w:w="416" w:type="dxa"/>
+            <w:tcW w:w="412" w:type="dxa"/>
             <w:vMerge w:val="continue"/>
             <w:tcBorders/>
           </w:tcPr>
@@ -9063,7 +9063,7 @@
         </w:tc>
         <w:tc>
           <w:tcPr>
-            <w:tcW w:w="543" w:type="dxa"/>
+            <w:tcW w:w="547" w:type="dxa"/>
             <w:vMerge w:val="continue"/>
             <w:tcBorders/>
             <w:vAlign w:val="center"/>
@@ -9202,7 +9202,7 @@
         </w:trPr>
         <w:tc>
           <w:tcPr>
-            <w:tcW w:w="416" w:type="dxa"/>
+            <w:tcW w:w="412" w:type="dxa"/>
             <w:vMerge w:val="continue"/>
             <w:tcBorders/>
           </w:tcPr>
@@ -9234,7 +9234,7 @@
         </w:tc>
         <w:tc>
           <w:tcPr>
-            <w:tcW w:w="543" w:type="dxa"/>
+            <w:tcW w:w="547" w:type="dxa"/>
             <w:vMerge w:val="continue"/>
             <w:tcBorders/>
             <w:vAlign w:val="center"/>
@@ -9378,7 +9378,7 @@
         </w:trPr>
         <w:tc>
           <w:tcPr>
-            <w:tcW w:w="416" w:type="dxa"/>
+            <w:tcW w:w="412" w:type="dxa"/>
             <w:vMerge w:val="continue"/>
             <w:tcBorders/>
           </w:tcPr>
@@ -9412,7 +9412,7 @@
         </w:tc>
         <w:tc>
           <w:tcPr>
-            <w:tcW w:w="543" w:type="dxa"/>
+            <w:tcW w:w="547" w:type="dxa"/>
             <w:vMerge w:val="continue"/>
             <w:tcBorders/>
             <w:vAlign w:val="center"/>
@@ -9553,7 +9553,7 @@
         </w:trPr>
         <w:tc>
           <w:tcPr>
-            <w:tcW w:w="416" w:type="dxa"/>
+            <w:tcW w:w="412" w:type="dxa"/>
             <w:vMerge w:val="continue"/>
             <w:tcBorders/>
           </w:tcPr>
@@ -9585,7 +9585,7 @@
         </w:tc>
         <w:tc>
           <w:tcPr>
-            <w:tcW w:w="543" w:type="dxa"/>
+            <w:tcW w:w="547" w:type="dxa"/>
             <w:vMerge w:val="continue"/>
             <w:tcBorders/>
             <w:vAlign w:val="center"/>
@@ -9724,7 +9724,7 @@
         </w:trPr>
         <w:tc>
           <w:tcPr>
-            <w:tcW w:w="416" w:type="dxa"/>
+            <w:tcW w:w="412" w:type="dxa"/>
             <w:vMerge w:val="continue"/>
             <w:tcBorders/>
           </w:tcPr>
@@ -9756,7 +9756,7 @@
         </w:tc>
         <w:tc>
           <w:tcPr>
-            <w:tcW w:w="543" w:type="dxa"/>
+            <w:tcW w:w="547" w:type="dxa"/>
             <w:vMerge w:val="continue"/>
             <w:tcBorders/>
             <w:vAlign w:val="center"/>
@@ -9895,7 +9895,7 @@
         </w:trPr>
         <w:tc>
           <w:tcPr>
-            <w:tcW w:w="416" w:type="dxa"/>
+            <w:tcW w:w="412" w:type="dxa"/>
             <w:vMerge w:val="continue"/>
             <w:tcBorders/>
           </w:tcPr>
@@ -9927,7 +9927,7 @@
         </w:tc>
         <w:tc>
           <w:tcPr>
-            <w:tcW w:w="543" w:type="dxa"/>
+            <w:tcW w:w="547" w:type="dxa"/>
             <w:vMerge w:val="continue"/>
             <w:tcBorders/>
             <w:vAlign w:val="center"/>
@@ -10067,7 +10067,7 @@
         </w:trPr>
         <w:tc>
           <w:tcPr>
-            <w:tcW w:w="416" w:type="dxa"/>
+            <w:tcW w:w="412" w:type="dxa"/>
             <w:vMerge w:val="continue"/>
             <w:tcBorders/>
           </w:tcPr>
@@ -10099,7 +10099,7 @@
         </w:tc>
         <w:tc>
           <w:tcPr>
-            <w:tcW w:w="543" w:type="dxa"/>
+            <w:tcW w:w="547" w:type="dxa"/>
             <w:vMerge w:val="continue"/>
             <w:tcBorders/>
             <w:vAlign w:val="center"/>
@@ -10239,7 +10239,7 @@
         </w:trPr>
         <w:tc>
           <w:tcPr>
-            <w:tcW w:w="416" w:type="dxa"/>
+            <w:tcW w:w="412" w:type="dxa"/>
             <w:vMerge w:val="continue"/>
             <w:tcBorders/>
           </w:tcPr>
@@ -10273,7 +10273,7 @@
         </w:tc>
         <w:tc>
           <w:tcPr>
-            <w:tcW w:w="543" w:type="dxa"/>
+            <w:tcW w:w="547" w:type="dxa"/>
             <w:vMerge w:val="continue"/>
             <w:tcBorders/>
             <w:vAlign w:val="center"/>
@@ -10413,7 +10413,7 @@
         </w:trPr>
         <w:tc>
           <w:tcPr>
-            <w:tcW w:w="416" w:type="dxa"/>
+            <w:tcW w:w="412" w:type="dxa"/>
             <w:vMerge w:val="continue"/>
             <w:tcBorders/>
           </w:tcPr>
@@ -10447,7 +10447,7 @@
         </w:tc>
         <w:tc>
           <w:tcPr>
-            <w:tcW w:w="543" w:type="dxa"/>
+            <w:tcW w:w="547" w:type="dxa"/>
             <w:vMerge w:val="continue"/>
             <w:tcBorders/>
             <w:vAlign w:val="center"/>
@@ -10587,7 +10587,7 @@
         </w:trPr>
         <w:tc>
           <w:tcPr>
-            <w:tcW w:w="416" w:type="dxa"/>
+            <w:tcW w:w="412" w:type="dxa"/>
             <w:vMerge w:val="continue"/>
             <w:tcBorders/>
           </w:tcPr>
@@ -10621,7 +10621,7 @@
         </w:tc>
         <w:tc>
           <w:tcPr>
-            <w:tcW w:w="543" w:type="dxa"/>
+            <w:tcW w:w="547" w:type="dxa"/>
             <w:vMerge w:val="continue"/>
             <w:tcBorders/>
             <w:vAlign w:val="center"/>
@@ -10761,7 +10761,7 @@
         </w:trPr>
         <w:tc>
           <w:tcPr>
-            <w:tcW w:w="416" w:type="dxa"/>
+            <w:tcW w:w="412" w:type="dxa"/>
             <w:vMerge w:val="continue"/>
             <w:tcBorders/>
           </w:tcPr>
@@ -10795,7 +10795,7 @@
         </w:tc>
         <w:tc>
           <w:tcPr>
-            <w:tcW w:w="543" w:type="dxa"/>
+            <w:tcW w:w="547" w:type="dxa"/>
             <w:vMerge w:val="continue"/>
             <w:tcBorders/>
             <w:vAlign w:val="center"/>
@@ -10935,7 +10935,7 @@
         </w:trPr>
         <w:tc>
           <w:tcPr>
-            <w:tcW w:w="416" w:type="dxa"/>
+            <w:tcW w:w="412" w:type="dxa"/>
             <w:vMerge w:val="continue"/>
             <w:tcBorders/>
           </w:tcPr>
@@ -10969,7 +10969,7 @@
         </w:tc>
         <w:tc>
           <w:tcPr>
-            <w:tcW w:w="543" w:type="dxa"/>
+            <w:tcW w:w="547" w:type="dxa"/>
             <w:vMerge w:val="continue"/>
             <w:tcBorders/>
             <w:vAlign w:val="center"/>
@@ -11109,7 +11109,7 @@
         </w:trPr>
         <w:tc>
           <w:tcPr>
-            <w:tcW w:w="416" w:type="dxa"/>
+            <w:tcW w:w="412" w:type="dxa"/>
             <w:vMerge w:val="continue"/>
             <w:tcBorders/>
           </w:tcPr>
@@ -11143,7 +11143,7 @@
         </w:tc>
         <w:tc>
           <w:tcPr>
-            <w:tcW w:w="543" w:type="dxa"/>
+            <w:tcW w:w="547" w:type="dxa"/>
             <w:vMerge w:val="continue"/>
             <w:tcBorders/>
             <w:vAlign w:val="center"/>
@@ -11283,7 +11283,7 @@
         </w:trPr>
         <w:tc>
           <w:tcPr>
-            <w:tcW w:w="416" w:type="dxa"/>
+            <w:tcW w:w="412" w:type="dxa"/>
             <w:vMerge w:val="continue"/>
             <w:tcBorders/>
           </w:tcPr>
@@ -11317,7 +11317,7 @@
         </w:tc>
         <w:tc>
           <w:tcPr>
-            <w:tcW w:w="543" w:type="dxa"/>
+            <w:tcW w:w="547" w:type="dxa"/>
             <w:vMerge w:val="continue"/>
             <w:tcBorders/>
             <w:vAlign w:val="center"/>
@@ -11457,7 +11457,7 @@
         </w:trPr>
         <w:tc>
           <w:tcPr>
-            <w:tcW w:w="416" w:type="dxa"/>
+            <w:tcW w:w="412" w:type="dxa"/>
             <w:vMerge w:val="continue"/>
             <w:tcBorders/>
           </w:tcPr>
@@ -11491,7 +11491,7 @@
         </w:tc>
         <w:tc>
           <w:tcPr>
-            <w:tcW w:w="543" w:type="dxa"/>
+            <w:tcW w:w="547" w:type="dxa"/>
             <w:vMerge w:val="continue"/>
             <w:tcBorders/>
             <w:vAlign w:val="center"/>
@@ -11631,7 +11631,7 @@
         </w:trPr>
         <w:tc>
           <w:tcPr>
-            <w:tcW w:w="416" w:type="dxa"/>
+            <w:tcW w:w="412" w:type="dxa"/>
             <w:tcBorders/>
             <w:textDirection w:val="btLr"/>
           </w:tcPr>
@@ -11664,7 +11664,7 @@
         </w:tc>
         <w:tc>
           <w:tcPr>
-            <w:tcW w:w="6355" w:type="dxa"/>
+            <w:tcW w:w="6359" w:type="dxa"/>
             <w:gridSpan w:val="2"/>
             <w:tcBorders/>
             <w:vAlign w:val="center"/>
@@ -11785,7 +11785,7 @@
         </w:trPr>
         <w:tc>
           <w:tcPr>
-            <w:tcW w:w="416" w:type="dxa"/>
+            <w:tcW w:w="412" w:type="dxa"/>
             <w:vMerge w:val="restart"/>
             <w:tcBorders/>
             <w:textDirection w:val="btLr"/>
@@ -11823,7 +11823,7 @@
         </w:tc>
         <w:tc>
           <w:tcPr>
-            <w:tcW w:w="6355" w:type="dxa"/>
+            <w:tcW w:w="6359" w:type="dxa"/>
             <w:gridSpan w:val="2"/>
             <w:tcBorders/>
             <w:vAlign w:val="center"/>
@@ -11930,7 +11930,7 @@
         </w:trPr>
         <w:tc>
           <w:tcPr>
-            <w:tcW w:w="416" w:type="dxa"/>
+            <w:tcW w:w="412" w:type="dxa"/>
             <w:vMerge w:val="continue"/>
             <w:tcBorders/>
           </w:tcPr>
@@ -11964,7 +11964,7 @@
         </w:tc>
         <w:tc>
           <w:tcPr>
-            <w:tcW w:w="6355" w:type="dxa"/>
+            <w:tcW w:w="6359" w:type="dxa"/>
             <w:gridSpan w:val="2"/>
             <w:tcBorders/>
             <w:vAlign w:val="center"/>
@@ -12071,7 +12071,7 @@
         </w:trPr>
         <w:tc>
           <w:tcPr>
-            <w:tcW w:w="416" w:type="dxa"/>
+            <w:tcW w:w="412" w:type="dxa"/>
             <w:vMerge w:val="continue"/>
             <w:tcBorders/>
           </w:tcPr>
@@ -12105,7 +12105,7 @@
         </w:tc>
         <w:tc>
           <w:tcPr>
-            <w:tcW w:w="6355" w:type="dxa"/>
+            <w:tcW w:w="6359" w:type="dxa"/>
             <w:gridSpan w:val="2"/>
             <w:tcBorders/>
             <w:vAlign w:val="center"/>
@@ -12212,7 +12212,7 @@
         </w:trPr>
         <w:tc>
           <w:tcPr>
-            <w:tcW w:w="416" w:type="dxa"/>
+            <w:tcW w:w="412" w:type="dxa"/>
             <w:vMerge w:val="continue"/>
             <w:tcBorders/>
           </w:tcPr>
@@ -12246,7 +12246,7 @@
         </w:tc>
         <w:tc>
           <w:tcPr>
-            <w:tcW w:w="6355" w:type="dxa"/>
+            <w:tcW w:w="6359" w:type="dxa"/>
             <w:gridSpan w:val="2"/>
             <w:tcBorders/>
             <w:vAlign w:val="center"/>
@@ -12353,7 +12353,7 @@
         </w:trPr>
         <w:tc>
           <w:tcPr>
-            <w:tcW w:w="416" w:type="dxa"/>
+            <w:tcW w:w="412" w:type="dxa"/>
             <w:vMerge w:val="continue"/>
             <w:tcBorders/>
           </w:tcPr>
@@ -12387,7 +12387,7 @@
         </w:tc>
         <w:tc>
           <w:tcPr>
-            <w:tcW w:w="6355" w:type="dxa"/>
+            <w:tcW w:w="6359" w:type="dxa"/>
             <w:gridSpan w:val="2"/>
             <w:tcBorders/>
             <w:vAlign w:val="center"/>
@@ -12494,7 +12494,7 @@
         </w:trPr>
         <w:tc>
           <w:tcPr>
-            <w:tcW w:w="416" w:type="dxa"/>
+            <w:tcW w:w="412" w:type="dxa"/>
             <w:vMerge w:val="continue"/>
             <w:tcBorders/>
           </w:tcPr>
@@ -12528,7 +12528,7 @@
         </w:tc>
         <w:tc>
           <w:tcPr>
-            <w:tcW w:w="6355" w:type="dxa"/>
+            <w:tcW w:w="6359" w:type="dxa"/>
             <w:gridSpan w:val="2"/>
             <w:tcBorders/>
             <w:vAlign w:val="center"/>
@@ -12636,7 +12636,7 @@
         </w:trPr>
         <w:tc>
           <w:tcPr>
-            <w:tcW w:w="416" w:type="dxa"/>
+            <w:tcW w:w="412" w:type="dxa"/>
             <w:vMerge w:val="continue"/>
             <w:tcBorders/>
           </w:tcPr>
@@ -12670,7 +12670,7 @@
         </w:tc>
         <w:tc>
           <w:tcPr>
-            <w:tcW w:w="6355" w:type="dxa"/>
+            <w:tcW w:w="6359" w:type="dxa"/>
             <w:gridSpan w:val="2"/>
             <w:tcBorders/>
             <w:vAlign w:val="center"/>
@@ -12778,7 +12778,7 @@
         </w:trPr>
         <w:tc>
           <w:tcPr>
-            <w:tcW w:w="416" w:type="dxa"/>
+            <w:tcW w:w="412" w:type="dxa"/>
             <w:vMerge w:val="continue"/>
             <w:tcBorders/>
           </w:tcPr>
@@ -12812,7 +12812,7 @@
         </w:tc>
         <w:tc>
           <w:tcPr>
-            <w:tcW w:w="6355" w:type="dxa"/>
+            <w:tcW w:w="6359" w:type="dxa"/>
             <w:gridSpan w:val="2"/>
             <w:tcBorders/>
             <w:vAlign w:val="center"/>
@@ -13007,15 +13007,15 @@
         <w:tblLook w:val="04a0" w:noHBand="0" w:noVBand="1" w:firstColumn="1" w:lastRow="0" w:lastColumn="0" w:firstRow="1"/>
       </w:tblPr>
       <w:tblGrid>
-        <w:gridCol w:w="4863"/>
-        <w:gridCol w:w="4152"/>
+        <w:gridCol w:w="4861"/>
+        <w:gridCol w:w="4154"/>
         <w:gridCol w:w="2184"/>
       </w:tblGrid>
       <w:tr>
         <w:trPr/>
         <w:tc>
           <w:tcPr>
-            <w:tcW w:w="4863" w:type="dxa"/>
+            <w:tcW w:w="4861" w:type="dxa"/>
             <w:tcBorders>
               <w:top w:val="single" w:sz="8" w:space="0" w:color="000000"/>
               <w:left w:val="single" w:sz="8" w:space="0" w:color="000000"/>
@@ -13045,7 +13045,7 @@
         </w:tc>
         <w:tc>
           <w:tcPr>
-            <w:tcW w:w="4152" w:type="dxa"/>
+            <w:tcW w:w="4154" w:type="dxa"/>
             <w:tcBorders>
               <w:top w:val="single" w:sz="8" w:space="0" w:color="000000"/>
               <w:left w:val="single" w:sz="8" w:space="0" w:color="000000"/>
@@ -13106,7 +13106,7 @@
         <w:trPr/>
         <w:tc>
           <w:tcPr>
-            <w:tcW w:w="4863" w:type="dxa"/>
+            <w:tcW w:w="4861" w:type="dxa"/>
             <w:tcBorders>
               <w:top w:val="single" w:sz="8" w:space="0" w:color="000000"/>
               <w:left w:val="single" w:sz="8" w:space="0" w:color="000000"/>
@@ -13150,7 +13150,7 @@
         </w:tc>
         <w:tc>
           <w:tcPr>
-            <w:tcW w:w="4152" w:type="dxa"/>
+            <w:tcW w:w="4154" w:type="dxa"/>
             <w:tcBorders>
               <w:top w:val="single" w:sz="8" w:space="0" w:color="000000"/>
               <w:left w:val="single" w:sz="8" w:space="0" w:color="000000"/>
@@ -13201,7 +13201,7 @@
         <w:trPr/>
         <w:tc>
           <w:tcPr>
-            <w:tcW w:w="4863" w:type="dxa"/>
+            <w:tcW w:w="4861" w:type="dxa"/>
             <w:tcBorders>
               <w:top w:val="single" w:sz="8" w:space="0" w:color="000000"/>
               <w:left w:val="single" w:sz="8" w:space="0" w:color="000000"/>
@@ -13228,7 +13228,7 @@
         </w:tc>
         <w:tc>
           <w:tcPr>
-            <w:tcW w:w="4152" w:type="dxa"/>
+            <w:tcW w:w="4154" w:type="dxa"/>
             <w:tcBorders>
               <w:top w:val="single" w:sz="8" w:space="0" w:color="000000"/>
               <w:left w:val="single" w:sz="8" w:space="0" w:color="000000"/>
@@ -13327,20 +13327,27 @@
             <w:pPr>
               <w:pStyle w:val="Contedodatabela"/>
               <w:widowControl/>
-              <w:spacing w:lineRule="auto" w:line="288" w:before="0" w:after="0"/>
-              <w:rPr>
-                <w:rFonts w:ascii="Arial;sans-serif" w:hAnsi="Arial;sans-serif" w:cs="CenturyGothic,Bold"/>
-                <w:bCs/>
-                <w:color w:val="000000"/>
-                <w:szCs w:val="16"/>
-              </w:rPr>
-            </w:pPr>
-            <w:r>
-              <w:rPr>
-                <w:rFonts w:cs="CenturyGothic,Bold" w:ascii="Arial;sans-serif" w:hAnsi="Arial;sans-serif"/>
-                <w:bCs/>
-                <w:color w:val="000000"/>
-                <w:szCs w:val="16"/>
+              <w:suppressAutoHyphens w:val="true"/>
+              <w:bidi w:val="0"/>
+              <w:spacing w:lineRule="auto" w:line="240" w:before="0" w:after="200"/>
+              <w:jc w:val="left"/>
+              <w:rPr>
+                <w:rFonts w:ascii="Calibri" w:hAnsi="Calibri" w:eastAsia="Calibri" w:cs="" w:asciiTheme="minorHAnsi" w:cstheme="minorBidi" w:eastAsiaTheme="minorHAnsi" w:hAnsiTheme="minorHAnsi"/>
+                <w:color w:val="auto"/>
+                <w:kern w:val="0"/>
+                <w:sz w:val="16"/>
+                <w:szCs w:val="22"/>
+                <w:lang w:val="pt-BR" w:eastAsia="en-US" w:bidi="ar-SA"/>
+              </w:rPr>
+            </w:pPr>
+            <w:r>
+              <w:rPr>
+                <w:rFonts w:eastAsia="Calibri" w:cs="" w:cstheme="minorBidi" w:eastAsiaTheme="minorHAnsi"/>
+                <w:color w:val="auto"/>
+                <w:kern w:val="0"/>
+                <w:sz w:val="16"/>
+                <w:szCs w:val="22"/>
+                <w:lang w:val="pt-BR" w:eastAsia="en-US" w:bidi="ar-SA"/>
               </w:rPr>
             </w:r>
           </w:p>
@@ -13360,22 +13367,27 @@
             <w:pPr>
               <w:pStyle w:val="Contedodatabela"/>
               <w:widowControl/>
-              <w:spacing w:lineRule="auto" w:line="240"/>
-              <w:rPr>
-                <w:b/>
-                <w:bCs/>
-                <w:color w:val="000000"/>
+              <w:suppressAutoHyphens w:val="true"/>
+              <w:bidi w:val="0"/>
+              <w:spacing w:lineRule="auto" w:line="240" w:before="0" w:after="200"/>
+              <w:jc w:val="left"/>
+              <w:rPr>
+                <w:rFonts w:ascii="Calibri" w:hAnsi="Calibri" w:eastAsia="Calibri" w:cs="" w:asciiTheme="minorHAnsi" w:cstheme="minorBidi" w:eastAsiaTheme="minorHAnsi" w:hAnsiTheme="minorHAnsi"/>
+                <w:color w:val="auto"/>
+                <w:kern w:val="0"/>
                 <w:sz w:val="16"/>
-                <w:szCs w:val="16"/>
-              </w:rPr>
-            </w:pPr>
-            <w:r>
-              <w:rPr>
-                <w:b/>
-                <w:bCs/>
-                <w:color w:val="000000"/>
+                <w:szCs w:val="22"/>
+                <w:lang w:val="pt-BR" w:eastAsia="en-US" w:bidi="ar-SA"/>
+              </w:rPr>
+            </w:pPr>
+            <w:r>
+              <w:rPr>
+                <w:rFonts w:eastAsia="Calibri" w:cs="" w:cstheme="minorBidi" w:eastAsiaTheme="minorHAnsi"/>
+                <w:color w:val="auto"/>
+                <w:kern w:val="0"/>
                 <w:sz w:val="16"/>
-                <w:szCs w:val="16"/>
+                <w:szCs w:val="22"/>
+                <w:lang w:val="pt-BR" w:eastAsia="en-US" w:bidi="ar-SA"/>
               </w:rPr>
             </w:r>
           </w:p>
@@ -13383,92 +13395,77 @@
             <w:pPr>
               <w:pStyle w:val="Contedodatabela"/>
               <w:widowControl/>
-              <w:spacing w:lineRule="auto" w:line="240"/>
-              <w:rPr>
-                <w:b/>
-                <w:bCs/>
-                <w:color w:val="000000"/>
+              <w:suppressAutoHyphens w:val="true"/>
+              <w:bidi w:val="0"/>
+              <w:spacing w:lineRule="auto" w:line="240" w:before="0" w:after="200"/>
+              <w:jc w:val="left"/>
+              <w:rPr>
+                <w:rFonts w:ascii="Calibri" w:hAnsi="Calibri" w:eastAsia="Calibri" w:cs="" w:asciiTheme="minorHAnsi" w:cstheme="minorBidi" w:eastAsiaTheme="minorHAnsi" w:hAnsiTheme="minorHAnsi"/>
+                <w:color w:val="auto"/>
+                <w:kern w:val="0"/>
                 <w:sz w:val="16"/>
-                <w:szCs w:val="16"/>
-              </w:rPr>
-            </w:pPr>
-            <w:r>
-              <w:rPr>
-                <w:rFonts w:eastAsia="MS Gothic" w:ascii="MS Gothic" w:hAnsi="MS Gothic"/>
+                <w:szCs w:val="22"/>
+                <w:lang w:val="pt-BR" w:eastAsia="en-US" w:bidi="ar-SA"/>
+              </w:rPr>
+            </w:pPr>
+            <w:r>
+              <w:rPr>
+                <w:rFonts w:eastAsia="Calibri" w:cs="" w:cstheme="minorBidi" w:eastAsiaTheme="minorHAnsi"/>
+                <w:color w:val="auto"/>
+                <w:kern w:val="0"/>
                 <w:sz w:val="16"/>
-                <w:szCs w:val="16"/>
-              </w:rPr>
-              <w:t>TR / Edital</w:t>
+                <w:szCs w:val="22"/>
+                <w:lang w:val="pt-BR" w:eastAsia="en-US" w:bidi="ar-SA"/>
+              </w:rPr>
+              <w:t>TR | Edital</w:t>
             </w:r>
           </w:p>
           <w:p>
             <w:pPr>
               <w:pStyle w:val="Contedodatabela"/>
               <w:widowControl/>
+              <w:suppressAutoHyphens w:val="true"/>
+              <w:bidi w:val="0"/>
               <w:spacing w:lineRule="auto" w:line="240" w:before="0" w:after="200"/>
-              <w:rPr>
-                <w:b/>
-                <w:bCs/>
-                <w:color w:val="000000"/>
+              <w:jc w:val="left"/>
+              <w:rPr>
+                <w:rFonts w:ascii="Calibri" w:hAnsi="Calibri" w:eastAsia="Calibri" w:cs="" w:asciiTheme="minorHAnsi" w:cstheme="minorBidi" w:eastAsiaTheme="minorHAnsi" w:hAnsiTheme="minorHAnsi"/>
+                <w:color w:val="auto"/>
+                <w:kern w:val="0"/>
                 <w:sz w:val="16"/>
-                <w:szCs w:val="16"/>
-              </w:rPr>
-            </w:pPr>
-            <w:r>
-              <w:rPr>
-                <w:rFonts w:eastAsia="MS Gothic" w:ascii="MS Gothic" w:hAnsi="MS Gothic"/>
+                <w:szCs w:val="22"/>
+                <w:lang w:val="pt-BR" w:eastAsia="en-US" w:bidi="ar-SA"/>
+              </w:rPr>
+            </w:pPr>
+            <w:r>
+              <w:rPr>
+                <w:rFonts w:eastAsia="Calibri" w:cs="" w:cstheme="minorBidi" w:eastAsiaTheme="minorHAnsi"/>
+                <w:color w:val="auto"/>
+                <w:kern w:val="0"/>
                 <w:sz w:val="16"/>
-                <w:szCs w:val="16"/>
+                <w:szCs w:val="22"/>
+                <w:lang w:val="pt-BR" w:eastAsia="en-US" w:bidi="ar-SA"/>
               </w:rPr>
               <w:t xml:space="preserve">☐ ☐ </w:t>
             </w:r>
             <w:r>
               <w:rPr>
+                <w:rFonts w:eastAsia="Calibri" w:cs="" w:cstheme="minorBidi" w:eastAsiaTheme="minorHAnsi"/>
+                <w:color w:val="auto"/>
+                <w:kern w:val="0"/>
                 <w:sz w:val="16"/>
+                <w:szCs w:val="22"/>
+                <w:lang w:val="pt-BR" w:eastAsia="en-US" w:bidi="ar-SA"/>
               </w:rPr>
               <w:t>Exclusivo</w:t>
               <w:br/>
               <w:t>ME/EPP/MEI</w:t>
               <w:br/>
-            </w:r>
-            <w:r>
-              <w:rPr>
-                <w:sz w:val="16"/>
-                <w:szCs w:val="16"/>
-              </w:rPr>
               <w:br/>
-            </w:r>
-            <w:r>
-              <w:rPr>
-                <w:rFonts w:eastAsia="MS Gothic" w:ascii="MS Gothic" w:hAnsi="MS Gothic"/>
-                <w:sz w:val="16"/>
-                <w:szCs w:val="16"/>
-              </w:rPr>
-              <w:t xml:space="preserve">☐ ☐ </w:t>
-            </w:r>
-            <w:r>
-              <w:rPr>
-                <w:sz w:val="16"/>
-                <w:szCs w:val="16"/>
-              </w:rPr>
-              <w:t>Consórcio</w:t>
+              <w:t>☐ ☐ Consórcio</w:t>
               <w:br/>
               <w:br/>
-            </w:r>
-            <w:r>
-              <w:rPr>
-                <w:rFonts w:eastAsia="MS Gothic" w:ascii="MS Gothic" w:hAnsi="MS Gothic"/>
-                <w:sz w:val="16"/>
-                <w:szCs w:val="16"/>
-              </w:rPr>
-              <w:t xml:space="preserve">☐ ☐ </w:t>
-            </w:r>
-            <w:r>
-              <w:rPr>
-                <w:sz w:val="16"/>
-                <w:szCs w:val="16"/>
-              </w:rPr>
-              <w:t>Cooperativa</w:t>
+              <w:t>☐ ☐ Cooperativa</w:t>
               <w:br/>
             </w:r>
           </w:p>
@@ -14069,9 +14066,6 @@
         <w:br/>
         <w:br/>
         <w:br/>
-        <w:br/>
-        <w:br/>
-        <w:br/>
       </w:r>
     </w:p>
     <w:tbl>
@@ -14089,21 +14083,22 @@
         <w:tblLook w:val="04a0" w:noHBand="0" w:noVBand="1" w:firstColumn="1" w:lastRow="0" w:lastColumn="0" w:firstRow="1"/>
       </w:tblPr>
       <w:tblGrid>
-        <w:gridCol w:w="1350"/>
-        <w:gridCol w:w="1450"/>
-        <w:gridCol w:w="451"/>
-        <w:gridCol w:w="477"/>
-        <w:gridCol w:w="1142"/>
-        <w:gridCol w:w="3429"/>
-        <w:gridCol w:w="1766"/>
-        <w:gridCol w:w="568"/>
-        <w:gridCol w:w="564"/>
+        <w:gridCol w:w="1079"/>
+        <w:gridCol w:w="1351"/>
+        <w:gridCol w:w="450"/>
+        <w:gridCol w:w="495"/>
+        <w:gridCol w:w="854"/>
+        <w:gridCol w:w="4157"/>
+        <w:gridCol w:w="1172"/>
+        <w:gridCol w:w="925"/>
+        <w:gridCol w:w="358"/>
+        <w:gridCol w:w="357"/>
       </w:tblGrid>
       <w:tr>
         <w:trPr/>
         <w:tc>
           <w:tcPr>
-            <w:tcW w:w="1350" w:type="dxa"/>
+            <w:tcW w:w="1079" w:type="dxa"/>
             <w:tcBorders>
               <w:top w:val="single" w:sz="8" w:space="0" w:color="000000"/>
               <w:left w:val="single" w:sz="8" w:space="0" w:color="000000"/>
@@ -14138,7 +14133,7 @@
         </w:tc>
         <w:tc>
           <w:tcPr>
-            <w:tcW w:w="1450" w:type="dxa"/>
+            <w:tcW w:w="1351" w:type="dxa"/>
             <w:tcBorders>
               <w:top w:val="single" w:sz="8" w:space="0" w:color="000000"/>
               <w:left w:val="single" w:sz="8" w:space="0" w:color="000000"/>
@@ -14175,7 +14170,7 @@
         </w:tc>
         <w:tc>
           <w:tcPr>
-            <w:tcW w:w="451" w:type="dxa"/>
+            <w:tcW w:w="450" w:type="dxa"/>
             <w:tcBorders>
               <w:top w:val="single" w:sz="8" w:space="0" w:color="000000"/>
               <w:left w:val="single" w:sz="8" w:space="0" w:color="000000"/>
@@ -14210,7 +14205,7 @@
         </w:tc>
         <w:tc>
           <w:tcPr>
-            <w:tcW w:w="477" w:type="dxa"/>
+            <w:tcW w:w="495" w:type="dxa"/>
             <w:tcBorders>
               <w:top w:val="single" w:sz="8" w:space="0" w:color="000000"/>
               <w:left w:val="single" w:sz="8" w:space="0" w:color="000000"/>
@@ -14245,7 +14240,7 @@
         </w:tc>
         <w:tc>
           <w:tcPr>
-            <w:tcW w:w="1142" w:type="dxa"/>
+            <w:tcW w:w="854" w:type="dxa"/>
             <w:tcBorders>
               <w:top w:val="single" w:sz="8" w:space="0" w:color="000000"/>
               <w:left w:val="single" w:sz="8" w:space="0" w:color="000000"/>
@@ -14280,7 +14275,7 @@
         </w:tc>
         <w:tc>
           <w:tcPr>
-            <w:tcW w:w="3429" w:type="dxa"/>
+            <w:tcW w:w="4157" w:type="dxa"/>
             <w:tcBorders>
               <w:top w:val="single" w:sz="8" w:space="0" w:color="000000"/>
               <w:left w:val="single" w:sz="8" w:space="0" w:color="000000"/>
@@ -14315,7 +14310,41 @@
         </w:tc>
         <w:tc>
           <w:tcPr>
-            <w:tcW w:w="1766" w:type="dxa"/>
+            <w:tcW w:w="1172" w:type="dxa"/>
+            <w:tcBorders>
+              <w:top w:val="single" w:sz="8" w:space="0" w:color="000000"/>
+              <w:left w:val="single" w:sz="8" w:space="0" w:color="000000"/>
+              <w:bottom w:val="single" w:sz="8" w:space="0" w:color="000000"/>
+            </w:tcBorders>
+            <w:vAlign w:val="center"/>
+          </w:tcPr>
+          <w:p>
+            <w:pPr>
+              <w:pStyle w:val="Contedodatabela"/>
+              <w:widowControl/>
+              <w:spacing w:lineRule="auto" w:line="288" w:before="0" w:after="0"/>
+              <w:jc w:val="center"/>
+              <w:rPr>
+                <w:sz w:val="16"/>
+                <w:szCs w:val="16"/>
+              </w:rPr>
+            </w:pPr>
+            <w:r>
+              <w:rPr>
+                <w:rFonts w:cs="CenturyGothic,Bold"/>
+                <w:b/>
+                <w:bCs/>
+                <w:color w:val="000000"/>
+                <w:sz w:val="16"/>
+                <w:szCs w:val="16"/>
+              </w:rPr>
+              <w:t>Valor unitário</w:t>
+            </w:r>
+          </w:p>
+        </w:tc>
+        <w:tc>
+          <w:tcPr>
+            <w:tcW w:w="925" w:type="dxa"/>
             <w:tcBorders>
               <w:top w:val="single" w:sz="8" w:space="0" w:color="000000"/>
               <w:left w:val="single" w:sz="8" w:space="0" w:color="000000"/>
@@ -14350,7 +14379,7 @@
         </w:tc>
         <w:tc>
           <w:tcPr>
-            <w:tcW w:w="568" w:type="dxa"/>
+            <w:tcW w:w="358" w:type="dxa"/>
             <w:tcBorders>
               <w:top w:val="single" w:sz="8" w:space="0" w:color="000000"/>
               <w:left w:val="single" w:sz="8" w:space="0" w:color="000000"/>
@@ -14385,7 +14414,7 @@
         </w:tc>
         <w:tc>
           <w:tcPr>
-            <w:tcW w:w="564" w:type="dxa"/>
+            <w:tcW w:w="357" w:type="dxa"/>
             <w:tcBorders>
               <w:top w:val="single" w:sz="8" w:space="0" w:color="000000"/>
               <w:left w:val="single" w:sz="8" w:space="0" w:color="000000"/>
@@ -14425,8 +14454,8 @@
         </w:trPr>
         <w:tc>
           <w:tcPr>
-            <w:tcW w:w="11197" w:type="dxa"/>
-            <w:gridSpan w:val="9"/>
+            <w:tcW w:w="11198" w:type="dxa"/>
+            <w:gridSpan w:val="10"/>
             <w:tcBorders>
               <w:top w:val="single" w:sz="8" w:space="0" w:color="000000"/>
               <w:left w:val="single" w:sz="8" w:space="0" w:color="000000"/>
@@ -14459,7 +14488,7 @@
         <w:trPr/>
         <w:tc>
           <w:tcPr>
-            <w:tcW w:w="1350" w:type="dxa"/>
+            <w:tcW w:w="1079" w:type="dxa"/>
             <w:tcBorders>
               <w:left w:val="single" w:sz="8" w:space="0" w:color="000000"/>
               <w:bottom w:val="single" w:sz="8" w:space="0" w:color="000000"/>
@@ -14490,7 +14519,7 @@
         </w:tc>
         <w:tc>
           <w:tcPr>
-            <w:tcW w:w="1450" w:type="dxa"/>
+            <w:tcW w:w="1351" w:type="dxa"/>
             <w:tcBorders>
               <w:left w:val="single" w:sz="8" w:space="0" w:color="000000"/>
               <w:bottom w:val="single" w:sz="8" w:space="0" w:color="000000"/>
@@ -14524,7 +14553,7 @@
         </w:tc>
         <w:tc>
           <w:tcPr>
-            <w:tcW w:w="451" w:type="dxa"/>
+            <w:tcW w:w="450" w:type="dxa"/>
             <w:tcBorders>
               <w:left w:val="single" w:sz="8" w:space="0" w:color="000000"/>
               <w:bottom w:val="single" w:sz="8" w:space="0" w:color="000000"/>
@@ -14556,7 +14585,7 @@
         </w:tc>
         <w:tc>
           <w:tcPr>
-            <w:tcW w:w="477" w:type="dxa"/>
+            <w:tcW w:w="495" w:type="dxa"/>
             <w:tcBorders>
               <w:left w:val="single" w:sz="8" w:space="0" w:color="000000"/>
               <w:bottom w:val="single" w:sz="8" w:space="0" w:color="000000"/>
@@ -14603,7 +14632,7 @@
         </w:tc>
         <w:tc>
           <w:tcPr>
-            <w:tcW w:w="1142" w:type="dxa"/>
+            <w:tcW w:w="854" w:type="dxa"/>
             <w:tcBorders>
               <w:left w:val="single" w:sz="8" w:space="0" w:color="000000"/>
               <w:bottom w:val="single" w:sz="8" w:space="0" w:color="000000"/>
@@ -14635,7 +14664,7 @@
         </w:tc>
         <w:tc>
           <w:tcPr>
-            <w:tcW w:w="3429" w:type="dxa"/>
+            <w:tcW w:w="4157" w:type="dxa"/>
             <w:tcBorders>
               <w:left w:val="single" w:sz="8" w:space="0" w:color="000000"/>
               <w:bottom w:val="single" w:sz="8" w:space="0" w:color="000000"/>
@@ -14676,7 +14705,39 @@
         </w:tc>
         <w:tc>
           <w:tcPr>
-            <w:tcW w:w="1766" w:type="dxa"/>
+            <w:tcW w:w="1172" w:type="dxa"/>
+            <w:tcBorders>
+              <w:left w:val="single" w:sz="8" w:space="0" w:color="000000"/>
+              <w:bottom w:val="single" w:sz="8" w:space="0" w:color="000000"/>
+            </w:tcBorders>
+            <w:shd w:color="auto" w:fill="FFFFFF" w:val="clear"/>
+            <w:vAlign w:val="center"/>
+          </w:tcPr>
+          <w:p>
+            <w:pPr>
+              <w:pStyle w:val="Contedodatabela"/>
+              <w:widowControl/>
+              <w:spacing w:lineRule="auto" w:line="288" w:before="0" w:after="0"/>
+              <w:jc w:val="center"/>
+              <w:rPr>
+                <w:sz w:val="16"/>
+                <w:szCs w:val="16"/>
+              </w:rPr>
+            </w:pPr>
+            <w:r>
+              <w:rPr>
+                <w:rFonts w:cs="CenturyGothic,Bold"/>
+                <w:bCs/>
+                <w:sz w:val="16"/>
+                <w:szCs w:val="16"/>
+              </w:rPr>
+              <w:t>{{ item.valor_unitario_previsto }}</w:t>
+            </w:r>
+          </w:p>
+        </w:tc>
+        <w:tc>
+          <w:tcPr>
+            <w:tcW w:w="925" w:type="dxa"/>
             <w:tcBorders>
               <w:left w:val="single" w:sz="8" w:space="0" w:color="000000"/>
               <w:bottom w:val="single" w:sz="8" w:space="0" w:color="000000"/>
@@ -14709,7 +14770,7 @@
         </w:tc>
         <w:tc>
           <w:tcPr>
-            <w:tcW w:w="568" w:type="dxa"/>
+            <w:tcW w:w="358" w:type="dxa"/>
             <w:tcBorders>
               <w:left w:val="single" w:sz="8" w:space="0" w:color="000000"/>
               <w:bottom w:val="single" w:sz="8" w:space="0" w:color="000000"/>
@@ -14736,7 +14797,7 @@
         </w:tc>
         <w:tc>
           <w:tcPr>
-            <w:tcW w:w="564" w:type="dxa"/>
+            <w:tcW w:w="357" w:type="dxa"/>
             <w:tcBorders>
               <w:left w:val="single" w:sz="8" w:space="0" w:color="000000"/>
               <w:bottom w:val="single" w:sz="8" w:space="0" w:color="000000"/>
@@ -14771,8 +14832,8 @@
         <w:trPr/>
         <w:tc>
           <w:tcPr>
-            <w:tcW w:w="11197" w:type="dxa"/>
-            <w:gridSpan w:val="9"/>
+            <w:tcW w:w="11198" w:type="dxa"/>
+            <w:gridSpan w:val="10"/>
             <w:tcBorders>
               <w:left w:val="single" w:sz="8" w:space="0" w:color="000000"/>
               <w:bottom w:val="single" w:sz="8" w:space="0" w:color="000000"/>
@@ -16010,6 +16071,19 @@
       <w:rFonts w:ascii="Arial" w:hAnsi="Arial" w:cs="Arial"/>
     </w:rPr>
   </w:style>
+  <w:style w:type="paragraph" w:styleId="TableHeading">
+    <w:name w:val="Table Heading"/>
+    <w:basedOn w:val="TableContents"/>
+    <w:qFormat/>
+    <w:pPr>
+      <w:suppressLineNumbers/>
+      <w:jc w:val="center"/>
+    </w:pPr>
+    <w:rPr>
+      <w:b/>
+      <w:bCs/>
+    </w:rPr>
+  </w:style>
   <w:style w:type="numbering" w:styleId="NoList" w:default="1">
     <w:name w:val="No List"/>
     <w:uiPriority w:val="99"/>

</xml_diff>

<commit_message>
aplicando formatação de valor moeda no model
</commit_message>
<xml_diff>
--- a/app/compras/templates_docs/CONFERENCIA_CD_COM_DISPUTA.docx
+++ b/app/compras/templates_docs/CONFERENCIA_CD_COM_DISPUTA.docx
@@ -6750,8 +6750,8 @@
         <w:tblLook w:val="04a0" w:noHBand="0" w:noVBand="1" w:firstColumn="1" w:lastRow="0" w:lastColumn="0" w:firstRow="1"/>
       </w:tblPr>
       <w:tblGrid>
-        <w:gridCol w:w="412"/>
-        <w:gridCol w:w="547"/>
+        <w:gridCol w:w="411"/>
+        <w:gridCol w:w="548"/>
         <w:gridCol w:w="5812"/>
         <w:gridCol w:w="1687"/>
         <w:gridCol w:w="1856"/>
@@ -6899,7 +6899,7 @@
         </w:trPr>
         <w:tc>
           <w:tcPr>
-            <w:tcW w:w="412" w:type="dxa"/>
+            <w:tcW w:w="411" w:type="dxa"/>
             <w:vMerge w:val="restart"/>
             <w:tcBorders/>
             <w:textDirection w:val="btLr"/>
@@ -6937,7 +6937,7 @@
         </w:tc>
         <w:tc>
           <w:tcPr>
-            <w:tcW w:w="6359" w:type="dxa"/>
+            <w:tcW w:w="6360" w:type="dxa"/>
             <w:gridSpan w:val="2"/>
             <w:tcBorders/>
             <w:vAlign w:val="center"/>
@@ -7087,7 +7087,7 @@
         </w:trPr>
         <w:tc>
           <w:tcPr>
-            <w:tcW w:w="412" w:type="dxa"/>
+            <w:tcW w:w="411" w:type="dxa"/>
             <w:vMerge w:val="continue"/>
             <w:tcBorders/>
           </w:tcPr>
@@ -7119,7 +7119,7 @@
         </w:tc>
         <w:tc>
           <w:tcPr>
-            <w:tcW w:w="6359" w:type="dxa"/>
+            <w:tcW w:w="6360" w:type="dxa"/>
             <w:gridSpan w:val="2"/>
             <w:tcBorders/>
             <w:vAlign w:val="center"/>
@@ -7226,7 +7226,7 @@
         </w:trPr>
         <w:tc>
           <w:tcPr>
-            <w:tcW w:w="412" w:type="dxa"/>
+            <w:tcW w:w="411" w:type="dxa"/>
             <w:vMerge w:val="continue"/>
             <w:tcBorders/>
           </w:tcPr>
@@ -7258,7 +7258,7 @@
         </w:tc>
         <w:tc>
           <w:tcPr>
-            <w:tcW w:w="6359" w:type="dxa"/>
+            <w:tcW w:w="6360" w:type="dxa"/>
             <w:gridSpan w:val="2"/>
             <w:tcBorders/>
             <w:vAlign w:val="center"/>
@@ -7365,7 +7365,7 @@
         </w:trPr>
         <w:tc>
           <w:tcPr>
-            <w:tcW w:w="412" w:type="dxa"/>
+            <w:tcW w:w="411" w:type="dxa"/>
             <w:vMerge w:val="continue"/>
             <w:tcBorders/>
           </w:tcPr>
@@ -7397,7 +7397,7 @@
         </w:tc>
         <w:tc>
           <w:tcPr>
-            <w:tcW w:w="6359" w:type="dxa"/>
+            <w:tcW w:w="6360" w:type="dxa"/>
             <w:gridSpan w:val="2"/>
             <w:tcBorders/>
             <w:vAlign w:val="center"/>
@@ -7560,7 +7560,7 @@
         </w:trPr>
         <w:tc>
           <w:tcPr>
-            <w:tcW w:w="412" w:type="dxa"/>
+            <w:tcW w:w="411" w:type="dxa"/>
             <w:vMerge w:val="continue"/>
             <w:tcBorders/>
           </w:tcPr>
@@ -7592,7 +7592,7 @@
         </w:tc>
         <w:tc>
           <w:tcPr>
-            <w:tcW w:w="6359" w:type="dxa"/>
+            <w:tcW w:w="6360" w:type="dxa"/>
             <w:gridSpan w:val="2"/>
             <w:tcBorders/>
             <w:vAlign w:val="center"/>
@@ -7699,7 +7699,7 @@
         </w:trPr>
         <w:tc>
           <w:tcPr>
-            <w:tcW w:w="412" w:type="dxa"/>
+            <w:tcW w:w="411" w:type="dxa"/>
             <w:vMerge w:val="continue"/>
             <w:tcBorders/>
           </w:tcPr>
@@ -7731,7 +7731,7 @@
         </w:tc>
         <w:tc>
           <w:tcPr>
-            <w:tcW w:w="6359" w:type="dxa"/>
+            <w:tcW w:w="6360" w:type="dxa"/>
             <w:gridSpan w:val="2"/>
             <w:tcBorders/>
             <w:vAlign w:val="center"/>
@@ -7838,7 +7838,7 @@
         </w:trPr>
         <w:tc>
           <w:tcPr>
-            <w:tcW w:w="412" w:type="dxa"/>
+            <w:tcW w:w="411" w:type="dxa"/>
             <w:vMerge w:val="continue"/>
             <w:tcBorders/>
           </w:tcPr>
@@ -7870,7 +7870,7 @@
         </w:tc>
         <w:tc>
           <w:tcPr>
-            <w:tcW w:w="6359" w:type="dxa"/>
+            <w:tcW w:w="6360" w:type="dxa"/>
             <w:gridSpan w:val="2"/>
             <w:tcBorders/>
             <w:vAlign w:val="center"/>
@@ -7977,7 +7977,7 @@
         </w:trPr>
         <w:tc>
           <w:tcPr>
-            <w:tcW w:w="412" w:type="dxa"/>
+            <w:tcW w:w="411" w:type="dxa"/>
             <w:vMerge w:val="restart"/>
             <w:tcBorders/>
             <w:textDirection w:val="btLr"/>
@@ -8014,7 +8014,7 @@
         </w:tc>
         <w:tc>
           <w:tcPr>
-            <w:tcW w:w="547" w:type="dxa"/>
+            <w:tcW w:w="548" w:type="dxa"/>
             <w:vMerge w:val="restart"/>
             <w:tcBorders/>
             <w:textDirection w:val="btLr"/>
@@ -8161,7 +8161,7 @@
         </w:trPr>
         <w:tc>
           <w:tcPr>
-            <w:tcW w:w="412" w:type="dxa"/>
+            <w:tcW w:w="411" w:type="dxa"/>
             <w:vMerge w:val="continue"/>
             <w:tcBorders/>
           </w:tcPr>
@@ -8193,7 +8193,7 @@
         </w:tc>
         <w:tc>
           <w:tcPr>
-            <w:tcW w:w="547" w:type="dxa"/>
+            <w:tcW w:w="548" w:type="dxa"/>
             <w:vMerge w:val="continue"/>
             <w:tcBorders/>
             <w:textDirection w:val="btLr"/>
@@ -8331,7 +8331,7 @@
         </w:trPr>
         <w:tc>
           <w:tcPr>
-            <w:tcW w:w="412" w:type="dxa"/>
+            <w:tcW w:w="411" w:type="dxa"/>
             <w:vMerge w:val="continue"/>
             <w:tcBorders/>
           </w:tcPr>
@@ -8363,7 +8363,7 @@
         </w:tc>
         <w:tc>
           <w:tcPr>
-            <w:tcW w:w="547" w:type="dxa"/>
+            <w:tcW w:w="548" w:type="dxa"/>
             <w:vMerge w:val="continue"/>
             <w:tcBorders/>
             <w:textDirection w:val="btLr"/>
@@ -8508,7 +8508,7 @@
         </w:trPr>
         <w:tc>
           <w:tcPr>
-            <w:tcW w:w="412" w:type="dxa"/>
+            <w:tcW w:w="411" w:type="dxa"/>
             <w:vMerge w:val="continue"/>
             <w:tcBorders/>
           </w:tcPr>
@@ -8540,7 +8540,7 @@
         </w:tc>
         <w:tc>
           <w:tcPr>
-            <w:tcW w:w="547" w:type="dxa"/>
+            <w:tcW w:w="548" w:type="dxa"/>
             <w:vMerge w:val="continue"/>
             <w:tcBorders/>
             <w:textDirection w:val="btLr"/>
@@ -8681,7 +8681,7 @@
         </w:trPr>
         <w:tc>
           <w:tcPr>
-            <w:tcW w:w="412" w:type="dxa"/>
+            <w:tcW w:w="411" w:type="dxa"/>
             <w:vMerge w:val="continue"/>
             <w:tcBorders/>
           </w:tcPr>
@@ -8713,7 +8713,7 @@
         </w:tc>
         <w:tc>
           <w:tcPr>
-            <w:tcW w:w="547" w:type="dxa"/>
+            <w:tcW w:w="548" w:type="dxa"/>
             <w:vMerge w:val="continue"/>
             <w:tcBorders/>
             <w:textDirection w:val="btLr"/>
@@ -8854,7 +8854,7 @@
         </w:trPr>
         <w:tc>
           <w:tcPr>
-            <w:tcW w:w="412" w:type="dxa"/>
+            <w:tcW w:w="411" w:type="dxa"/>
             <w:vMerge w:val="continue"/>
             <w:tcBorders/>
           </w:tcPr>
@@ -8886,7 +8886,7 @@
         </w:tc>
         <w:tc>
           <w:tcPr>
-            <w:tcW w:w="547" w:type="dxa"/>
+            <w:tcW w:w="548" w:type="dxa"/>
             <w:vMerge w:val="restart"/>
             <w:tcBorders/>
             <w:textDirection w:val="btLr"/>
@@ -9031,7 +9031,7 @@
         </w:trPr>
         <w:tc>
           <w:tcPr>
-            <w:tcW w:w="412" w:type="dxa"/>
+            <w:tcW w:w="411" w:type="dxa"/>
             <w:vMerge w:val="continue"/>
             <w:tcBorders/>
           </w:tcPr>
@@ -9063,7 +9063,7 @@
         </w:tc>
         <w:tc>
           <w:tcPr>
-            <w:tcW w:w="547" w:type="dxa"/>
+            <w:tcW w:w="548" w:type="dxa"/>
             <w:vMerge w:val="continue"/>
             <w:tcBorders/>
             <w:vAlign w:val="center"/>
@@ -9202,7 +9202,7 @@
         </w:trPr>
         <w:tc>
           <w:tcPr>
-            <w:tcW w:w="412" w:type="dxa"/>
+            <w:tcW w:w="411" w:type="dxa"/>
             <w:vMerge w:val="continue"/>
             <w:tcBorders/>
           </w:tcPr>
@@ -9234,7 +9234,7 @@
         </w:tc>
         <w:tc>
           <w:tcPr>
-            <w:tcW w:w="547" w:type="dxa"/>
+            <w:tcW w:w="548" w:type="dxa"/>
             <w:vMerge w:val="continue"/>
             <w:tcBorders/>
             <w:vAlign w:val="center"/>
@@ -9378,7 +9378,7 @@
         </w:trPr>
         <w:tc>
           <w:tcPr>
-            <w:tcW w:w="412" w:type="dxa"/>
+            <w:tcW w:w="411" w:type="dxa"/>
             <w:vMerge w:val="continue"/>
             <w:tcBorders/>
           </w:tcPr>
@@ -9412,7 +9412,7 @@
         </w:tc>
         <w:tc>
           <w:tcPr>
-            <w:tcW w:w="547" w:type="dxa"/>
+            <w:tcW w:w="548" w:type="dxa"/>
             <w:vMerge w:val="continue"/>
             <w:tcBorders/>
             <w:vAlign w:val="center"/>
@@ -9553,7 +9553,7 @@
         </w:trPr>
         <w:tc>
           <w:tcPr>
-            <w:tcW w:w="412" w:type="dxa"/>
+            <w:tcW w:w="411" w:type="dxa"/>
             <w:vMerge w:val="continue"/>
             <w:tcBorders/>
           </w:tcPr>
@@ -9585,7 +9585,7 @@
         </w:tc>
         <w:tc>
           <w:tcPr>
-            <w:tcW w:w="547" w:type="dxa"/>
+            <w:tcW w:w="548" w:type="dxa"/>
             <w:vMerge w:val="continue"/>
             <w:tcBorders/>
             <w:vAlign w:val="center"/>
@@ -9724,7 +9724,7 @@
         </w:trPr>
         <w:tc>
           <w:tcPr>
-            <w:tcW w:w="412" w:type="dxa"/>
+            <w:tcW w:w="411" w:type="dxa"/>
             <w:vMerge w:val="continue"/>
             <w:tcBorders/>
           </w:tcPr>
@@ -9756,7 +9756,7 @@
         </w:tc>
         <w:tc>
           <w:tcPr>
-            <w:tcW w:w="547" w:type="dxa"/>
+            <w:tcW w:w="548" w:type="dxa"/>
             <w:vMerge w:val="continue"/>
             <w:tcBorders/>
             <w:vAlign w:val="center"/>
@@ -9895,7 +9895,7 @@
         </w:trPr>
         <w:tc>
           <w:tcPr>
-            <w:tcW w:w="412" w:type="dxa"/>
+            <w:tcW w:w="411" w:type="dxa"/>
             <w:vMerge w:val="continue"/>
             <w:tcBorders/>
           </w:tcPr>
@@ -9927,7 +9927,7 @@
         </w:tc>
         <w:tc>
           <w:tcPr>
-            <w:tcW w:w="547" w:type="dxa"/>
+            <w:tcW w:w="548" w:type="dxa"/>
             <w:vMerge w:val="continue"/>
             <w:tcBorders/>
             <w:vAlign w:val="center"/>
@@ -10067,7 +10067,7 @@
         </w:trPr>
         <w:tc>
           <w:tcPr>
-            <w:tcW w:w="412" w:type="dxa"/>
+            <w:tcW w:w="411" w:type="dxa"/>
             <w:vMerge w:val="continue"/>
             <w:tcBorders/>
           </w:tcPr>
@@ -10099,7 +10099,7 @@
         </w:tc>
         <w:tc>
           <w:tcPr>
-            <w:tcW w:w="547" w:type="dxa"/>
+            <w:tcW w:w="548" w:type="dxa"/>
             <w:vMerge w:val="continue"/>
             <w:tcBorders/>
             <w:vAlign w:val="center"/>
@@ -10239,7 +10239,7 @@
         </w:trPr>
         <w:tc>
           <w:tcPr>
-            <w:tcW w:w="412" w:type="dxa"/>
+            <w:tcW w:w="411" w:type="dxa"/>
             <w:vMerge w:val="continue"/>
             <w:tcBorders/>
           </w:tcPr>
@@ -10273,7 +10273,7 @@
         </w:tc>
         <w:tc>
           <w:tcPr>
-            <w:tcW w:w="547" w:type="dxa"/>
+            <w:tcW w:w="548" w:type="dxa"/>
             <w:vMerge w:val="continue"/>
             <w:tcBorders/>
             <w:vAlign w:val="center"/>
@@ -10413,7 +10413,7 @@
         </w:trPr>
         <w:tc>
           <w:tcPr>
-            <w:tcW w:w="412" w:type="dxa"/>
+            <w:tcW w:w="411" w:type="dxa"/>
             <w:vMerge w:val="continue"/>
             <w:tcBorders/>
           </w:tcPr>
@@ -10447,7 +10447,7 @@
         </w:tc>
         <w:tc>
           <w:tcPr>
-            <w:tcW w:w="547" w:type="dxa"/>
+            <w:tcW w:w="548" w:type="dxa"/>
             <w:vMerge w:val="continue"/>
             <w:tcBorders/>
             <w:vAlign w:val="center"/>
@@ -10587,7 +10587,7 @@
         </w:trPr>
         <w:tc>
           <w:tcPr>
-            <w:tcW w:w="412" w:type="dxa"/>
+            <w:tcW w:w="411" w:type="dxa"/>
             <w:vMerge w:val="continue"/>
             <w:tcBorders/>
           </w:tcPr>
@@ -10621,7 +10621,7 @@
         </w:tc>
         <w:tc>
           <w:tcPr>
-            <w:tcW w:w="547" w:type="dxa"/>
+            <w:tcW w:w="548" w:type="dxa"/>
             <w:vMerge w:val="continue"/>
             <w:tcBorders/>
             <w:vAlign w:val="center"/>
@@ -10761,7 +10761,7 @@
         </w:trPr>
         <w:tc>
           <w:tcPr>
-            <w:tcW w:w="412" w:type="dxa"/>
+            <w:tcW w:w="411" w:type="dxa"/>
             <w:vMerge w:val="continue"/>
             <w:tcBorders/>
           </w:tcPr>
@@ -10795,7 +10795,7 @@
         </w:tc>
         <w:tc>
           <w:tcPr>
-            <w:tcW w:w="547" w:type="dxa"/>
+            <w:tcW w:w="548" w:type="dxa"/>
             <w:vMerge w:val="continue"/>
             <w:tcBorders/>
             <w:vAlign w:val="center"/>
@@ -10935,7 +10935,7 @@
         </w:trPr>
         <w:tc>
           <w:tcPr>
-            <w:tcW w:w="412" w:type="dxa"/>
+            <w:tcW w:w="411" w:type="dxa"/>
             <w:vMerge w:val="continue"/>
             <w:tcBorders/>
           </w:tcPr>
@@ -10969,7 +10969,7 @@
         </w:tc>
         <w:tc>
           <w:tcPr>
-            <w:tcW w:w="547" w:type="dxa"/>
+            <w:tcW w:w="548" w:type="dxa"/>
             <w:vMerge w:val="continue"/>
             <w:tcBorders/>
             <w:vAlign w:val="center"/>
@@ -11109,7 +11109,7 @@
         </w:trPr>
         <w:tc>
           <w:tcPr>
-            <w:tcW w:w="412" w:type="dxa"/>
+            <w:tcW w:w="411" w:type="dxa"/>
             <w:vMerge w:val="continue"/>
             <w:tcBorders/>
           </w:tcPr>
@@ -11143,7 +11143,7 @@
         </w:tc>
         <w:tc>
           <w:tcPr>
-            <w:tcW w:w="547" w:type="dxa"/>
+            <w:tcW w:w="548" w:type="dxa"/>
             <w:vMerge w:val="continue"/>
             <w:tcBorders/>
             <w:vAlign w:val="center"/>
@@ -11283,7 +11283,7 @@
         </w:trPr>
         <w:tc>
           <w:tcPr>
-            <w:tcW w:w="412" w:type="dxa"/>
+            <w:tcW w:w="411" w:type="dxa"/>
             <w:vMerge w:val="continue"/>
             <w:tcBorders/>
           </w:tcPr>
@@ -11317,7 +11317,7 @@
         </w:tc>
         <w:tc>
           <w:tcPr>
-            <w:tcW w:w="547" w:type="dxa"/>
+            <w:tcW w:w="548" w:type="dxa"/>
             <w:vMerge w:val="continue"/>
             <w:tcBorders/>
             <w:vAlign w:val="center"/>
@@ -11457,7 +11457,7 @@
         </w:trPr>
         <w:tc>
           <w:tcPr>
-            <w:tcW w:w="412" w:type="dxa"/>
+            <w:tcW w:w="411" w:type="dxa"/>
             <w:vMerge w:val="continue"/>
             <w:tcBorders/>
           </w:tcPr>
@@ -11491,7 +11491,7 @@
         </w:tc>
         <w:tc>
           <w:tcPr>
-            <w:tcW w:w="547" w:type="dxa"/>
+            <w:tcW w:w="548" w:type="dxa"/>
             <w:vMerge w:val="continue"/>
             <w:tcBorders/>
             <w:vAlign w:val="center"/>
@@ -11631,7 +11631,7 @@
         </w:trPr>
         <w:tc>
           <w:tcPr>
-            <w:tcW w:w="412" w:type="dxa"/>
+            <w:tcW w:w="411" w:type="dxa"/>
             <w:tcBorders/>
             <w:textDirection w:val="btLr"/>
           </w:tcPr>
@@ -11664,7 +11664,7 @@
         </w:tc>
         <w:tc>
           <w:tcPr>
-            <w:tcW w:w="6359" w:type="dxa"/>
+            <w:tcW w:w="6360" w:type="dxa"/>
             <w:gridSpan w:val="2"/>
             <w:tcBorders/>
             <w:vAlign w:val="center"/>
@@ -11785,7 +11785,7 @@
         </w:trPr>
         <w:tc>
           <w:tcPr>
-            <w:tcW w:w="412" w:type="dxa"/>
+            <w:tcW w:w="411" w:type="dxa"/>
             <w:vMerge w:val="restart"/>
             <w:tcBorders/>
             <w:textDirection w:val="btLr"/>
@@ -11823,7 +11823,7 @@
         </w:tc>
         <w:tc>
           <w:tcPr>
-            <w:tcW w:w="6359" w:type="dxa"/>
+            <w:tcW w:w="6360" w:type="dxa"/>
             <w:gridSpan w:val="2"/>
             <w:tcBorders/>
             <w:vAlign w:val="center"/>
@@ -11930,7 +11930,7 @@
         </w:trPr>
         <w:tc>
           <w:tcPr>
-            <w:tcW w:w="412" w:type="dxa"/>
+            <w:tcW w:w="411" w:type="dxa"/>
             <w:vMerge w:val="continue"/>
             <w:tcBorders/>
           </w:tcPr>
@@ -11964,7 +11964,7 @@
         </w:tc>
         <w:tc>
           <w:tcPr>
-            <w:tcW w:w="6359" w:type="dxa"/>
+            <w:tcW w:w="6360" w:type="dxa"/>
             <w:gridSpan w:val="2"/>
             <w:tcBorders/>
             <w:vAlign w:val="center"/>
@@ -12071,7 +12071,7 @@
         </w:trPr>
         <w:tc>
           <w:tcPr>
-            <w:tcW w:w="412" w:type="dxa"/>
+            <w:tcW w:w="411" w:type="dxa"/>
             <w:vMerge w:val="continue"/>
             <w:tcBorders/>
           </w:tcPr>
@@ -12105,7 +12105,7 @@
         </w:tc>
         <w:tc>
           <w:tcPr>
-            <w:tcW w:w="6359" w:type="dxa"/>
+            <w:tcW w:w="6360" w:type="dxa"/>
             <w:gridSpan w:val="2"/>
             <w:tcBorders/>
             <w:vAlign w:val="center"/>
@@ -12212,7 +12212,7 @@
         </w:trPr>
         <w:tc>
           <w:tcPr>
-            <w:tcW w:w="412" w:type="dxa"/>
+            <w:tcW w:w="411" w:type="dxa"/>
             <w:vMerge w:val="continue"/>
             <w:tcBorders/>
           </w:tcPr>
@@ -12246,7 +12246,7 @@
         </w:tc>
         <w:tc>
           <w:tcPr>
-            <w:tcW w:w="6359" w:type="dxa"/>
+            <w:tcW w:w="6360" w:type="dxa"/>
             <w:gridSpan w:val="2"/>
             <w:tcBorders/>
             <w:vAlign w:val="center"/>
@@ -12353,7 +12353,7 @@
         </w:trPr>
         <w:tc>
           <w:tcPr>
-            <w:tcW w:w="412" w:type="dxa"/>
+            <w:tcW w:w="411" w:type="dxa"/>
             <w:vMerge w:val="continue"/>
             <w:tcBorders/>
           </w:tcPr>
@@ -12387,7 +12387,7 @@
         </w:tc>
         <w:tc>
           <w:tcPr>
-            <w:tcW w:w="6359" w:type="dxa"/>
+            <w:tcW w:w="6360" w:type="dxa"/>
             <w:gridSpan w:val="2"/>
             <w:tcBorders/>
             <w:vAlign w:val="center"/>
@@ -12494,7 +12494,7 @@
         </w:trPr>
         <w:tc>
           <w:tcPr>
-            <w:tcW w:w="412" w:type="dxa"/>
+            <w:tcW w:w="411" w:type="dxa"/>
             <w:vMerge w:val="continue"/>
             <w:tcBorders/>
           </w:tcPr>
@@ -12528,7 +12528,7 @@
         </w:tc>
         <w:tc>
           <w:tcPr>
-            <w:tcW w:w="6359" w:type="dxa"/>
+            <w:tcW w:w="6360" w:type="dxa"/>
             <w:gridSpan w:val="2"/>
             <w:tcBorders/>
             <w:vAlign w:val="center"/>
@@ -12636,7 +12636,7 @@
         </w:trPr>
         <w:tc>
           <w:tcPr>
-            <w:tcW w:w="412" w:type="dxa"/>
+            <w:tcW w:w="411" w:type="dxa"/>
             <w:vMerge w:val="continue"/>
             <w:tcBorders/>
           </w:tcPr>
@@ -12670,7 +12670,7 @@
         </w:tc>
         <w:tc>
           <w:tcPr>
-            <w:tcW w:w="6359" w:type="dxa"/>
+            <w:tcW w:w="6360" w:type="dxa"/>
             <w:gridSpan w:val="2"/>
             <w:tcBorders/>
             <w:vAlign w:val="center"/>
@@ -12778,7 +12778,7 @@
         </w:trPr>
         <w:tc>
           <w:tcPr>
-            <w:tcW w:w="412" w:type="dxa"/>
+            <w:tcW w:w="411" w:type="dxa"/>
             <w:vMerge w:val="continue"/>
             <w:tcBorders/>
           </w:tcPr>
@@ -12812,7 +12812,7 @@
         </w:tc>
         <w:tc>
           <w:tcPr>
-            <w:tcW w:w="6359" w:type="dxa"/>
+            <w:tcW w:w="6360" w:type="dxa"/>
             <w:gridSpan w:val="2"/>
             <w:tcBorders/>
             <w:vAlign w:val="center"/>
@@ -13275,7 +13275,25 @@
                 <w:sz w:val="20"/>
                 <w:szCs w:val="16"/>
               </w:rPr>
-              <w:t>{{ valor_total_previsto }}</w:t>
+              <w:t>{{ valor_total_previsto</w:t>
+            </w:r>
+            <w:r>
+              <w:rPr>
+                <w:rFonts w:cs="CenturyGothic,Bold" w:ascii="Arial;sans-serif" w:hAnsi="Arial;sans-serif"/>
+                <w:bCs/>
+                <w:sz w:val="20"/>
+                <w:szCs w:val="16"/>
+              </w:rPr>
+              <w:t>_brl</w:t>
+            </w:r>
+            <w:r>
+              <w:rPr>
+                <w:rFonts w:cs="CenturyGothic,Bold" w:ascii="Arial;sans-serif" w:hAnsi="Arial;sans-serif"/>
+                <w:bCs/>
+                <w:sz w:val="20"/>
+                <w:szCs w:val="16"/>
+              </w:rPr>
+              <w:t xml:space="preserve"> }}</w:t>
             </w:r>
           </w:p>
         </w:tc>
@@ -14731,7 +14749,25 @@
                 <w:sz w:val="16"/>
                 <w:szCs w:val="16"/>
               </w:rPr>
-              <w:t>{{ item.valor_unitario_previsto }}</w:t>
+              <w:t>{{ item.valor_unitario_previsto</w:t>
+            </w:r>
+            <w:r>
+              <w:rPr>
+                <w:rFonts w:cs="CenturyGothic,Bold"/>
+                <w:bCs/>
+                <w:sz w:val="16"/>
+                <w:szCs w:val="16"/>
+              </w:rPr>
+              <w:t>_brl</w:t>
+            </w:r>
+            <w:r>
+              <w:rPr>
+                <w:rFonts w:cs="CenturyGothic,Bold"/>
+                <w:bCs/>
+                <w:sz w:val="16"/>
+                <w:szCs w:val="16"/>
+              </w:rPr>
+              <w:t xml:space="preserve"> }}</w:t>
             </w:r>
           </w:p>
         </w:tc>
@@ -14989,7 +15025,7 @@
   <w:comment w:id="0" w:author="Kleber" w:date="2024-11-05T10:51:00Z" w:initials="K">
     <w:p>
       <w:pPr>
-        <w:overflowPunct w:val="false"/>
+        <w:overflowPunct w:val="true"/>
         <w:spacing w:lineRule="auto" w:line="240" w:before="0" w:after="0"/>
         <w:rPr/>
       </w:pPr>
@@ -15005,7 +15041,7 @@
     </w:p>
     <w:p>
       <w:pPr>
-        <w:overflowPunct w:val="false"/>
+        <w:overflowPunct w:val="true"/>
         <w:spacing w:lineRule="auto" w:line="240" w:before="0" w:after="0"/>
         <w:rPr/>
       </w:pPr>
@@ -15023,7 +15059,7 @@
   <w:comment w:id="1" w:author="Kleber Nomura" w:date="2025-10-30T09:26:00Z" w:initials="KN">
     <w:p>
       <w:pPr>
-        <w:overflowPunct w:val="false"/>
+        <w:overflowPunct w:val="true"/>
         <w:spacing w:lineRule="auto" w:line="240" w:before="0" w:after="0"/>
         <w:rPr/>
       </w:pPr>
@@ -15041,7 +15077,7 @@
   <w:comment w:id="2" w:author="Kleber" w:date="2024-09-27T09:45:00Z" w:initials="K">
     <w:p>
       <w:pPr>
-        <w:overflowPunct w:val="false"/>
+        <w:overflowPunct w:val="true"/>
         <w:spacing w:lineRule="auto" w:line="240" w:before="0" w:after="0"/>
         <w:rPr/>
       </w:pPr>
@@ -15059,7 +15095,7 @@
   <w:comment w:id="3" w:author="Kleber" w:date="2024-09-13T14:07:00Z" w:initials="K">
     <w:p>
       <w:pPr>
-        <w:overflowPunct w:val="false"/>
+        <w:overflowPunct w:val="true"/>
         <w:spacing w:lineRule="auto" w:line="240" w:before="0" w:after="0"/>
         <w:rPr/>
       </w:pPr>
@@ -15077,7 +15113,7 @@
   <w:comment w:id="4" w:author="Kleber" w:date="2024-08-16T11:43:00Z" w:initials="K">
     <w:p>
       <w:pPr>
-        <w:overflowPunct w:val="false"/>
+        <w:overflowPunct w:val="true"/>
         <w:spacing w:lineRule="auto" w:line="240" w:before="0" w:after="0"/>
         <w:rPr/>
       </w:pPr>
@@ -15095,7 +15131,7 @@
   <w:comment w:id="5" w:author="Kleber" w:date="2024-09-04T11:23:00Z" w:initials="K">
     <w:p>
       <w:pPr>
-        <w:overflowPunct w:val="false"/>
+        <w:overflowPunct w:val="true"/>
         <w:spacing w:lineRule="auto" w:line="240" w:before="0" w:after="0"/>
         <w:rPr/>
       </w:pPr>
@@ -15113,7 +15149,7 @@
   <w:comment w:id="7" w:author="Kleber" w:date="2024-08-22T10:22:00Z" w:initials="K">
     <w:p>
       <w:pPr>
-        <w:overflowPunct w:val="false"/>
+        <w:overflowPunct w:val="true"/>
         <w:spacing w:lineRule="auto" w:line="240" w:before="0" w:after="0"/>
         <w:rPr/>
       </w:pPr>
@@ -15131,7 +15167,7 @@
   <w:comment w:id="6" w:author="Kleber" w:date="2025-06-18T11:05:00Z" w:initials="K">
     <w:p>
       <w:pPr>
-        <w:overflowPunct w:val="false"/>
+        <w:overflowPunct w:val="true"/>
         <w:spacing w:lineRule="auto" w:line="240" w:before="0" w:after="0"/>
         <w:rPr/>
       </w:pPr>

</xml_diff>

<commit_message>
adicionados checks nos modelos de documentos
</commit_message>
<xml_diff>
--- a/app/compras/templates_docs/CONFERENCIA_CD_COM_DISPUTA.docx
+++ b/app/compras/templates_docs/CONFERENCIA_CD_COM_DISPUTA.docx
@@ -6750,8 +6750,8 @@
         <w:tblLook w:val="04a0" w:noHBand="0" w:noVBand="1" w:firstColumn="1" w:lastRow="0" w:lastColumn="0" w:firstRow="1"/>
       </w:tblPr>
       <w:tblGrid>
-        <w:gridCol w:w="411"/>
-        <w:gridCol w:w="548"/>
+        <w:gridCol w:w="410"/>
+        <w:gridCol w:w="549"/>
         <w:gridCol w:w="5812"/>
         <w:gridCol w:w="1687"/>
         <w:gridCol w:w="1856"/>
@@ -6899,7 +6899,7 @@
         </w:trPr>
         <w:tc>
           <w:tcPr>
-            <w:tcW w:w="411" w:type="dxa"/>
+            <w:tcW w:w="410" w:type="dxa"/>
             <w:vMerge w:val="restart"/>
             <w:tcBorders/>
             <w:textDirection w:val="btLr"/>
@@ -6937,7 +6937,7 @@
         </w:tc>
         <w:tc>
           <w:tcPr>
-            <w:tcW w:w="6360" w:type="dxa"/>
+            <w:tcW w:w="6361" w:type="dxa"/>
             <w:gridSpan w:val="2"/>
             <w:tcBorders/>
             <w:vAlign w:val="center"/>
@@ -7087,7 +7087,7 @@
         </w:trPr>
         <w:tc>
           <w:tcPr>
-            <w:tcW w:w="411" w:type="dxa"/>
+            <w:tcW w:w="410" w:type="dxa"/>
             <w:vMerge w:val="continue"/>
             <w:tcBorders/>
           </w:tcPr>
@@ -7119,7 +7119,7 @@
         </w:tc>
         <w:tc>
           <w:tcPr>
-            <w:tcW w:w="6360" w:type="dxa"/>
+            <w:tcW w:w="6361" w:type="dxa"/>
             <w:gridSpan w:val="2"/>
             <w:tcBorders/>
             <w:vAlign w:val="center"/>
@@ -7226,7 +7226,7 @@
         </w:trPr>
         <w:tc>
           <w:tcPr>
-            <w:tcW w:w="411" w:type="dxa"/>
+            <w:tcW w:w="410" w:type="dxa"/>
             <w:vMerge w:val="continue"/>
             <w:tcBorders/>
           </w:tcPr>
@@ -7258,7 +7258,7 @@
         </w:tc>
         <w:tc>
           <w:tcPr>
-            <w:tcW w:w="6360" w:type="dxa"/>
+            <w:tcW w:w="6361" w:type="dxa"/>
             <w:gridSpan w:val="2"/>
             <w:tcBorders/>
             <w:vAlign w:val="center"/>
@@ -7365,7 +7365,7 @@
         </w:trPr>
         <w:tc>
           <w:tcPr>
-            <w:tcW w:w="411" w:type="dxa"/>
+            <w:tcW w:w="410" w:type="dxa"/>
             <w:vMerge w:val="continue"/>
             <w:tcBorders/>
           </w:tcPr>
@@ -7397,7 +7397,7 @@
         </w:tc>
         <w:tc>
           <w:tcPr>
-            <w:tcW w:w="6360" w:type="dxa"/>
+            <w:tcW w:w="6361" w:type="dxa"/>
             <w:gridSpan w:val="2"/>
             <w:tcBorders/>
             <w:vAlign w:val="center"/>
@@ -7560,7 +7560,7 @@
         </w:trPr>
         <w:tc>
           <w:tcPr>
-            <w:tcW w:w="411" w:type="dxa"/>
+            <w:tcW w:w="410" w:type="dxa"/>
             <w:vMerge w:val="continue"/>
             <w:tcBorders/>
           </w:tcPr>
@@ -7592,7 +7592,7 @@
         </w:tc>
         <w:tc>
           <w:tcPr>
-            <w:tcW w:w="6360" w:type="dxa"/>
+            <w:tcW w:w="6361" w:type="dxa"/>
             <w:gridSpan w:val="2"/>
             <w:tcBorders/>
             <w:vAlign w:val="center"/>
@@ -7699,7 +7699,7 @@
         </w:trPr>
         <w:tc>
           <w:tcPr>
-            <w:tcW w:w="411" w:type="dxa"/>
+            <w:tcW w:w="410" w:type="dxa"/>
             <w:vMerge w:val="continue"/>
             <w:tcBorders/>
           </w:tcPr>
@@ -7731,7 +7731,7 @@
         </w:tc>
         <w:tc>
           <w:tcPr>
-            <w:tcW w:w="6360" w:type="dxa"/>
+            <w:tcW w:w="6361" w:type="dxa"/>
             <w:gridSpan w:val="2"/>
             <w:tcBorders/>
             <w:vAlign w:val="center"/>
@@ -7838,7 +7838,7 @@
         </w:trPr>
         <w:tc>
           <w:tcPr>
-            <w:tcW w:w="411" w:type="dxa"/>
+            <w:tcW w:w="410" w:type="dxa"/>
             <w:vMerge w:val="continue"/>
             <w:tcBorders/>
           </w:tcPr>
@@ -7870,7 +7870,7 @@
         </w:tc>
         <w:tc>
           <w:tcPr>
-            <w:tcW w:w="6360" w:type="dxa"/>
+            <w:tcW w:w="6361" w:type="dxa"/>
             <w:gridSpan w:val="2"/>
             <w:tcBorders/>
             <w:vAlign w:val="center"/>
@@ -7977,7 +7977,7 @@
         </w:trPr>
         <w:tc>
           <w:tcPr>
-            <w:tcW w:w="411" w:type="dxa"/>
+            <w:tcW w:w="410" w:type="dxa"/>
             <w:vMerge w:val="restart"/>
             <w:tcBorders/>
             <w:textDirection w:val="btLr"/>
@@ -8014,7 +8014,7 @@
         </w:tc>
         <w:tc>
           <w:tcPr>
-            <w:tcW w:w="548" w:type="dxa"/>
+            <w:tcW w:w="549" w:type="dxa"/>
             <w:vMerge w:val="restart"/>
             <w:tcBorders/>
             <w:textDirection w:val="btLr"/>
@@ -8161,7 +8161,7 @@
         </w:trPr>
         <w:tc>
           <w:tcPr>
-            <w:tcW w:w="411" w:type="dxa"/>
+            <w:tcW w:w="410" w:type="dxa"/>
             <w:vMerge w:val="continue"/>
             <w:tcBorders/>
           </w:tcPr>
@@ -8193,7 +8193,7 @@
         </w:tc>
         <w:tc>
           <w:tcPr>
-            <w:tcW w:w="548" w:type="dxa"/>
+            <w:tcW w:w="549" w:type="dxa"/>
             <w:vMerge w:val="continue"/>
             <w:tcBorders/>
             <w:textDirection w:val="btLr"/>
@@ -8331,7 +8331,7 @@
         </w:trPr>
         <w:tc>
           <w:tcPr>
-            <w:tcW w:w="411" w:type="dxa"/>
+            <w:tcW w:w="410" w:type="dxa"/>
             <w:vMerge w:val="continue"/>
             <w:tcBorders/>
           </w:tcPr>
@@ -8363,7 +8363,7 @@
         </w:tc>
         <w:tc>
           <w:tcPr>
-            <w:tcW w:w="548" w:type="dxa"/>
+            <w:tcW w:w="549" w:type="dxa"/>
             <w:vMerge w:val="continue"/>
             <w:tcBorders/>
             <w:textDirection w:val="btLr"/>
@@ -8508,7 +8508,7 @@
         </w:trPr>
         <w:tc>
           <w:tcPr>
-            <w:tcW w:w="411" w:type="dxa"/>
+            <w:tcW w:w="410" w:type="dxa"/>
             <w:vMerge w:val="continue"/>
             <w:tcBorders/>
           </w:tcPr>
@@ -8540,7 +8540,7 @@
         </w:tc>
         <w:tc>
           <w:tcPr>
-            <w:tcW w:w="548" w:type="dxa"/>
+            <w:tcW w:w="549" w:type="dxa"/>
             <w:vMerge w:val="continue"/>
             <w:tcBorders/>
             <w:textDirection w:val="btLr"/>
@@ -8681,7 +8681,7 @@
         </w:trPr>
         <w:tc>
           <w:tcPr>
-            <w:tcW w:w="411" w:type="dxa"/>
+            <w:tcW w:w="410" w:type="dxa"/>
             <w:vMerge w:val="continue"/>
             <w:tcBorders/>
           </w:tcPr>
@@ -8713,7 +8713,7 @@
         </w:tc>
         <w:tc>
           <w:tcPr>
-            <w:tcW w:w="548" w:type="dxa"/>
+            <w:tcW w:w="549" w:type="dxa"/>
             <w:vMerge w:val="continue"/>
             <w:tcBorders/>
             <w:textDirection w:val="btLr"/>
@@ -8854,7 +8854,7 @@
         </w:trPr>
         <w:tc>
           <w:tcPr>
-            <w:tcW w:w="411" w:type="dxa"/>
+            <w:tcW w:w="410" w:type="dxa"/>
             <w:vMerge w:val="continue"/>
             <w:tcBorders/>
           </w:tcPr>
@@ -8886,7 +8886,7 @@
         </w:tc>
         <w:tc>
           <w:tcPr>
-            <w:tcW w:w="548" w:type="dxa"/>
+            <w:tcW w:w="549" w:type="dxa"/>
             <w:vMerge w:val="restart"/>
             <w:tcBorders/>
             <w:textDirection w:val="btLr"/>
@@ -9031,7 +9031,7 @@
         </w:trPr>
         <w:tc>
           <w:tcPr>
-            <w:tcW w:w="411" w:type="dxa"/>
+            <w:tcW w:w="410" w:type="dxa"/>
             <w:vMerge w:val="continue"/>
             <w:tcBorders/>
           </w:tcPr>
@@ -9063,7 +9063,7 @@
         </w:tc>
         <w:tc>
           <w:tcPr>
-            <w:tcW w:w="548" w:type="dxa"/>
+            <w:tcW w:w="549" w:type="dxa"/>
             <w:vMerge w:val="continue"/>
             <w:tcBorders/>
             <w:vAlign w:val="center"/>
@@ -9202,7 +9202,7 @@
         </w:trPr>
         <w:tc>
           <w:tcPr>
-            <w:tcW w:w="411" w:type="dxa"/>
+            <w:tcW w:w="410" w:type="dxa"/>
             <w:vMerge w:val="continue"/>
             <w:tcBorders/>
           </w:tcPr>
@@ -9234,7 +9234,7 @@
         </w:tc>
         <w:tc>
           <w:tcPr>
-            <w:tcW w:w="548" w:type="dxa"/>
+            <w:tcW w:w="549" w:type="dxa"/>
             <w:vMerge w:val="continue"/>
             <w:tcBorders/>
             <w:vAlign w:val="center"/>
@@ -9378,7 +9378,7 @@
         </w:trPr>
         <w:tc>
           <w:tcPr>
-            <w:tcW w:w="411" w:type="dxa"/>
+            <w:tcW w:w="410" w:type="dxa"/>
             <w:vMerge w:val="continue"/>
             <w:tcBorders/>
           </w:tcPr>
@@ -9412,7 +9412,7 @@
         </w:tc>
         <w:tc>
           <w:tcPr>
-            <w:tcW w:w="548" w:type="dxa"/>
+            <w:tcW w:w="549" w:type="dxa"/>
             <w:vMerge w:val="continue"/>
             <w:tcBorders/>
             <w:vAlign w:val="center"/>
@@ -9553,7 +9553,7 @@
         </w:trPr>
         <w:tc>
           <w:tcPr>
-            <w:tcW w:w="411" w:type="dxa"/>
+            <w:tcW w:w="410" w:type="dxa"/>
             <w:vMerge w:val="continue"/>
             <w:tcBorders/>
           </w:tcPr>
@@ -9585,7 +9585,7 @@
         </w:tc>
         <w:tc>
           <w:tcPr>
-            <w:tcW w:w="548" w:type="dxa"/>
+            <w:tcW w:w="549" w:type="dxa"/>
             <w:vMerge w:val="continue"/>
             <w:tcBorders/>
             <w:vAlign w:val="center"/>
@@ -9724,7 +9724,7 @@
         </w:trPr>
         <w:tc>
           <w:tcPr>
-            <w:tcW w:w="411" w:type="dxa"/>
+            <w:tcW w:w="410" w:type="dxa"/>
             <w:vMerge w:val="continue"/>
             <w:tcBorders/>
           </w:tcPr>
@@ -9756,7 +9756,7 @@
         </w:tc>
         <w:tc>
           <w:tcPr>
-            <w:tcW w:w="548" w:type="dxa"/>
+            <w:tcW w:w="549" w:type="dxa"/>
             <w:vMerge w:val="continue"/>
             <w:tcBorders/>
             <w:vAlign w:val="center"/>
@@ -9895,7 +9895,7 @@
         </w:trPr>
         <w:tc>
           <w:tcPr>
-            <w:tcW w:w="411" w:type="dxa"/>
+            <w:tcW w:w="410" w:type="dxa"/>
             <w:vMerge w:val="continue"/>
             <w:tcBorders/>
           </w:tcPr>
@@ -9927,7 +9927,7 @@
         </w:tc>
         <w:tc>
           <w:tcPr>
-            <w:tcW w:w="548" w:type="dxa"/>
+            <w:tcW w:w="549" w:type="dxa"/>
             <w:vMerge w:val="continue"/>
             <w:tcBorders/>
             <w:vAlign w:val="center"/>
@@ -10067,7 +10067,7 @@
         </w:trPr>
         <w:tc>
           <w:tcPr>
-            <w:tcW w:w="411" w:type="dxa"/>
+            <w:tcW w:w="410" w:type="dxa"/>
             <w:vMerge w:val="continue"/>
             <w:tcBorders/>
           </w:tcPr>
@@ -10099,7 +10099,7 @@
         </w:tc>
         <w:tc>
           <w:tcPr>
-            <w:tcW w:w="548" w:type="dxa"/>
+            <w:tcW w:w="549" w:type="dxa"/>
             <w:vMerge w:val="continue"/>
             <w:tcBorders/>
             <w:vAlign w:val="center"/>
@@ -10239,7 +10239,7 @@
         </w:trPr>
         <w:tc>
           <w:tcPr>
-            <w:tcW w:w="411" w:type="dxa"/>
+            <w:tcW w:w="410" w:type="dxa"/>
             <w:vMerge w:val="continue"/>
             <w:tcBorders/>
           </w:tcPr>
@@ -10273,7 +10273,7 @@
         </w:tc>
         <w:tc>
           <w:tcPr>
-            <w:tcW w:w="548" w:type="dxa"/>
+            <w:tcW w:w="549" w:type="dxa"/>
             <w:vMerge w:val="continue"/>
             <w:tcBorders/>
             <w:vAlign w:val="center"/>
@@ -10413,7 +10413,7 @@
         </w:trPr>
         <w:tc>
           <w:tcPr>
-            <w:tcW w:w="411" w:type="dxa"/>
+            <w:tcW w:w="410" w:type="dxa"/>
             <w:vMerge w:val="continue"/>
             <w:tcBorders/>
           </w:tcPr>
@@ -10447,7 +10447,7 @@
         </w:tc>
         <w:tc>
           <w:tcPr>
-            <w:tcW w:w="548" w:type="dxa"/>
+            <w:tcW w:w="549" w:type="dxa"/>
             <w:vMerge w:val="continue"/>
             <w:tcBorders/>
             <w:vAlign w:val="center"/>
@@ -10587,7 +10587,7 @@
         </w:trPr>
         <w:tc>
           <w:tcPr>
-            <w:tcW w:w="411" w:type="dxa"/>
+            <w:tcW w:w="410" w:type="dxa"/>
             <w:vMerge w:val="continue"/>
             <w:tcBorders/>
           </w:tcPr>
@@ -10621,7 +10621,7 @@
         </w:tc>
         <w:tc>
           <w:tcPr>
-            <w:tcW w:w="548" w:type="dxa"/>
+            <w:tcW w:w="549" w:type="dxa"/>
             <w:vMerge w:val="continue"/>
             <w:tcBorders/>
             <w:vAlign w:val="center"/>
@@ -10761,7 +10761,7 @@
         </w:trPr>
         <w:tc>
           <w:tcPr>
-            <w:tcW w:w="411" w:type="dxa"/>
+            <w:tcW w:w="410" w:type="dxa"/>
             <w:vMerge w:val="continue"/>
             <w:tcBorders/>
           </w:tcPr>
@@ -10795,7 +10795,7 @@
         </w:tc>
         <w:tc>
           <w:tcPr>
-            <w:tcW w:w="548" w:type="dxa"/>
+            <w:tcW w:w="549" w:type="dxa"/>
             <w:vMerge w:val="continue"/>
             <w:tcBorders/>
             <w:vAlign w:val="center"/>
@@ -10935,7 +10935,7 @@
         </w:trPr>
         <w:tc>
           <w:tcPr>
-            <w:tcW w:w="411" w:type="dxa"/>
+            <w:tcW w:w="410" w:type="dxa"/>
             <w:vMerge w:val="continue"/>
             <w:tcBorders/>
           </w:tcPr>
@@ -10969,7 +10969,7 @@
         </w:tc>
         <w:tc>
           <w:tcPr>
-            <w:tcW w:w="548" w:type="dxa"/>
+            <w:tcW w:w="549" w:type="dxa"/>
             <w:vMerge w:val="continue"/>
             <w:tcBorders/>
             <w:vAlign w:val="center"/>
@@ -11109,7 +11109,7 @@
         </w:trPr>
         <w:tc>
           <w:tcPr>
-            <w:tcW w:w="411" w:type="dxa"/>
+            <w:tcW w:w="410" w:type="dxa"/>
             <w:vMerge w:val="continue"/>
             <w:tcBorders/>
           </w:tcPr>
@@ -11143,7 +11143,7 @@
         </w:tc>
         <w:tc>
           <w:tcPr>
-            <w:tcW w:w="548" w:type="dxa"/>
+            <w:tcW w:w="549" w:type="dxa"/>
             <w:vMerge w:val="continue"/>
             <w:tcBorders/>
             <w:vAlign w:val="center"/>
@@ -11283,7 +11283,7 @@
         </w:trPr>
         <w:tc>
           <w:tcPr>
-            <w:tcW w:w="411" w:type="dxa"/>
+            <w:tcW w:w="410" w:type="dxa"/>
             <w:vMerge w:val="continue"/>
             <w:tcBorders/>
           </w:tcPr>
@@ -11317,7 +11317,7 @@
         </w:tc>
         <w:tc>
           <w:tcPr>
-            <w:tcW w:w="548" w:type="dxa"/>
+            <w:tcW w:w="549" w:type="dxa"/>
             <w:vMerge w:val="continue"/>
             <w:tcBorders/>
             <w:vAlign w:val="center"/>
@@ -11457,7 +11457,7 @@
         </w:trPr>
         <w:tc>
           <w:tcPr>
-            <w:tcW w:w="411" w:type="dxa"/>
+            <w:tcW w:w="410" w:type="dxa"/>
             <w:vMerge w:val="continue"/>
             <w:tcBorders/>
           </w:tcPr>
@@ -11491,7 +11491,7 @@
         </w:tc>
         <w:tc>
           <w:tcPr>
-            <w:tcW w:w="548" w:type="dxa"/>
+            <w:tcW w:w="549" w:type="dxa"/>
             <w:vMerge w:val="continue"/>
             <w:tcBorders/>
             <w:vAlign w:val="center"/>
@@ -11631,7 +11631,7 @@
         </w:trPr>
         <w:tc>
           <w:tcPr>
-            <w:tcW w:w="411" w:type="dxa"/>
+            <w:tcW w:w="410" w:type="dxa"/>
             <w:tcBorders/>
             <w:textDirection w:val="btLr"/>
           </w:tcPr>
@@ -11664,7 +11664,7 @@
         </w:tc>
         <w:tc>
           <w:tcPr>
-            <w:tcW w:w="6360" w:type="dxa"/>
+            <w:tcW w:w="6361" w:type="dxa"/>
             <w:gridSpan w:val="2"/>
             <w:tcBorders/>
             <w:vAlign w:val="center"/>
@@ -11785,7 +11785,7 @@
         </w:trPr>
         <w:tc>
           <w:tcPr>
-            <w:tcW w:w="411" w:type="dxa"/>
+            <w:tcW w:w="410" w:type="dxa"/>
             <w:vMerge w:val="restart"/>
             <w:tcBorders/>
             <w:textDirection w:val="btLr"/>
@@ -11823,7 +11823,7 @@
         </w:tc>
         <w:tc>
           <w:tcPr>
-            <w:tcW w:w="6360" w:type="dxa"/>
+            <w:tcW w:w="6361" w:type="dxa"/>
             <w:gridSpan w:val="2"/>
             <w:tcBorders/>
             <w:vAlign w:val="center"/>
@@ -11930,7 +11930,7 @@
         </w:trPr>
         <w:tc>
           <w:tcPr>
-            <w:tcW w:w="411" w:type="dxa"/>
+            <w:tcW w:w="410" w:type="dxa"/>
             <w:vMerge w:val="continue"/>
             <w:tcBorders/>
           </w:tcPr>
@@ -11964,7 +11964,7 @@
         </w:tc>
         <w:tc>
           <w:tcPr>
-            <w:tcW w:w="6360" w:type="dxa"/>
+            <w:tcW w:w="6361" w:type="dxa"/>
             <w:gridSpan w:val="2"/>
             <w:tcBorders/>
             <w:vAlign w:val="center"/>
@@ -12071,7 +12071,7 @@
         </w:trPr>
         <w:tc>
           <w:tcPr>
-            <w:tcW w:w="411" w:type="dxa"/>
+            <w:tcW w:w="410" w:type="dxa"/>
             <w:vMerge w:val="continue"/>
             <w:tcBorders/>
           </w:tcPr>
@@ -12105,7 +12105,7 @@
         </w:tc>
         <w:tc>
           <w:tcPr>
-            <w:tcW w:w="6360" w:type="dxa"/>
+            <w:tcW w:w="6361" w:type="dxa"/>
             <w:gridSpan w:val="2"/>
             <w:tcBorders/>
             <w:vAlign w:val="center"/>
@@ -12212,7 +12212,7 @@
         </w:trPr>
         <w:tc>
           <w:tcPr>
-            <w:tcW w:w="411" w:type="dxa"/>
+            <w:tcW w:w="410" w:type="dxa"/>
             <w:vMerge w:val="continue"/>
             <w:tcBorders/>
           </w:tcPr>
@@ -12246,7 +12246,7 @@
         </w:tc>
         <w:tc>
           <w:tcPr>
-            <w:tcW w:w="6360" w:type="dxa"/>
+            <w:tcW w:w="6361" w:type="dxa"/>
             <w:gridSpan w:val="2"/>
             <w:tcBorders/>
             <w:vAlign w:val="center"/>
@@ -12353,7 +12353,7 @@
         </w:trPr>
         <w:tc>
           <w:tcPr>
-            <w:tcW w:w="411" w:type="dxa"/>
+            <w:tcW w:w="410" w:type="dxa"/>
             <w:vMerge w:val="continue"/>
             <w:tcBorders/>
           </w:tcPr>
@@ -12387,7 +12387,7 @@
         </w:tc>
         <w:tc>
           <w:tcPr>
-            <w:tcW w:w="6360" w:type="dxa"/>
+            <w:tcW w:w="6361" w:type="dxa"/>
             <w:gridSpan w:val="2"/>
             <w:tcBorders/>
             <w:vAlign w:val="center"/>
@@ -12494,7 +12494,7 @@
         </w:trPr>
         <w:tc>
           <w:tcPr>
-            <w:tcW w:w="411" w:type="dxa"/>
+            <w:tcW w:w="410" w:type="dxa"/>
             <w:vMerge w:val="continue"/>
             <w:tcBorders/>
           </w:tcPr>
@@ -12528,7 +12528,7 @@
         </w:tc>
         <w:tc>
           <w:tcPr>
-            <w:tcW w:w="6360" w:type="dxa"/>
+            <w:tcW w:w="6361" w:type="dxa"/>
             <w:gridSpan w:val="2"/>
             <w:tcBorders/>
             <w:vAlign w:val="center"/>
@@ -12636,7 +12636,7 @@
         </w:trPr>
         <w:tc>
           <w:tcPr>
-            <w:tcW w:w="411" w:type="dxa"/>
+            <w:tcW w:w="410" w:type="dxa"/>
             <w:vMerge w:val="continue"/>
             <w:tcBorders/>
           </w:tcPr>
@@ -12670,7 +12670,7 @@
         </w:tc>
         <w:tc>
           <w:tcPr>
-            <w:tcW w:w="6360" w:type="dxa"/>
+            <w:tcW w:w="6361" w:type="dxa"/>
             <w:gridSpan w:val="2"/>
             <w:tcBorders/>
             <w:vAlign w:val="center"/>
@@ -12778,7 +12778,7 @@
         </w:trPr>
         <w:tc>
           <w:tcPr>
-            <w:tcW w:w="411" w:type="dxa"/>
+            <w:tcW w:w="410" w:type="dxa"/>
             <w:vMerge w:val="continue"/>
             <w:tcBorders/>
           </w:tcPr>
@@ -12812,7 +12812,7 @@
         </w:tc>
         <w:tc>
           <w:tcPr>
-            <w:tcW w:w="6360" w:type="dxa"/>
+            <w:tcW w:w="6361" w:type="dxa"/>
             <w:gridSpan w:val="2"/>
             <w:tcBorders/>
             <w:vAlign w:val="center"/>
@@ -13275,25 +13275,7 @@
                 <w:sz w:val="20"/>
                 <w:szCs w:val="16"/>
               </w:rPr>
-              <w:t>{{ valor_total_previsto</w:t>
-            </w:r>
-            <w:r>
-              <w:rPr>
-                <w:rFonts w:cs="CenturyGothic,Bold" w:ascii="Arial;sans-serif" w:hAnsi="Arial;sans-serif"/>
-                <w:bCs/>
-                <w:sz w:val="20"/>
-                <w:szCs w:val="16"/>
-              </w:rPr>
-              <w:t>_brl</w:t>
-            </w:r>
-            <w:r>
-              <w:rPr>
-                <w:rFonts w:cs="CenturyGothic,Bold" w:ascii="Arial;sans-serif" w:hAnsi="Arial;sans-serif"/>
-                <w:bCs/>
-                <w:sz w:val="20"/>
-                <w:szCs w:val="16"/>
-              </w:rPr>
-              <w:t xml:space="preserve"> }}</w:t>
+              <w:t>{{ valor_total_previsto_brl }}</w:t>
             </w:r>
           </w:p>
         </w:tc>
@@ -13324,16 +13306,17 @@
         <w:tblLook w:val="04a0" w:noHBand="0" w:noVBand="1" w:firstColumn="1" w:lastRow="0" w:lastColumn="0" w:firstRow="1"/>
       </w:tblPr>
       <w:tblGrid>
-        <w:gridCol w:w="5414"/>
-        <w:gridCol w:w="1980"/>
-        <w:gridCol w:w="1351"/>
-        <w:gridCol w:w="2453"/>
+        <w:gridCol w:w="3649"/>
+        <w:gridCol w:w="1856"/>
+        <w:gridCol w:w="2160"/>
+        <w:gridCol w:w="1350"/>
+        <w:gridCol w:w="2183"/>
       </w:tblGrid>
       <w:tr>
         <w:trPr/>
         <w:tc>
           <w:tcPr>
-            <w:tcW w:w="5414" w:type="dxa"/>
+            <w:tcW w:w="3649" w:type="dxa"/>
             <w:tcBorders>
               <w:top w:val="single" w:sz="8" w:space="0" w:color="000000"/>
               <w:left w:val="single" w:sz="8" w:space="0" w:color="000000"/>
@@ -13372,14 +13355,256 @@
         </w:tc>
         <w:tc>
           <w:tcPr>
-            <w:tcW w:w="1980" w:type="dxa"/>
+            <w:tcW w:w="1856" w:type="dxa"/>
+            <w:tcBorders>
+              <w:top w:val="single" w:sz="8" w:space="0" w:color="000000"/>
+              <w:left w:val="single" w:sz="8" w:space="0" w:color="000000"/>
+              <w:bottom w:val="single" w:sz="8" w:space="0" w:color="000000"/>
+            </w:tcBorders>
+          </w:tcPr>
+          <w:p>
+            <w:pPr>
+              <w:pStyle w:val="Contedodatabela"/>
+              <w:widowControl/>
+              <w:suppressAutoHyphens w:val="true"/>
+              <w:bidi w:val="0"/>
+              <w:spacing w:lineRule="auto" w:line="240" w:before="0" w:after="200"/>
+              <w:jc w:val="center"/>
+              <w:rPr>
+                <w:rFonts w:ascii="Calibri" w:hAnsi="Calibri" w:eastAsia="Calibri" w:cs="" w:asciiTheme="minorHAnsi" w:cstheme="minorBidi" w:eastAsiaTheme="minorHAnsi" w:hAnsiTheme="minorHAnsi"/>
+                <w:color w:val="auto"/>
+                <w:kern w:val="0"/>
+                <w:sz w:val="16"/>
+                <w:szCs w:val="22"/>
+                <w:lang w:val="pt-BR" w:eastAsia="en-US" w:bidi="ar-SA"/>
+              </w:rPr>
+            </w:pPr>
+            <w:r>
+              <w:rPr>
+                <w:rFonts w:eastAsia="Calibri" w:cs="" w:cstheme="minorBidi" w:eastAsiaTheme="minorHAnsi"/>
+                <w:color w:val="auto"/>
+                <w:kern w:val="0"/>
+                <w:sz w:val="16"/>
+                <w:szCs w:val="22"/>
+                <w:lang w:val="pt-BR" w:eastAsia="en-US" w:bidi="ar-SA"/>
+              </w:rPr>
+              <w:t>TERMO DE   REFERÊNCIA</w:t>
+            </w:r>
+          </w:p>
+          <w:p>
+            <w:pPr>
+              <w:pStyle w:val="Contedodatabela"/>
+              <w:widowControl/>
+              <w:suppressAutoHyphens w:val="true"/>
+              <w:bidi w:val="0"/>
+              <w:spacing w:lineRule="auto" w:line="240" w:before="57" w:after="257"/>
+              <w:jc w:val="left"/>
+              <w:rPr>
+                <w:sz w:val="16"/>
+                <w:szCs w:val="16"/>
+              </w:rPr>
+            </w:pPr>
+            <w:r>
+              <w:rPr>
+                <w:rFonts w:cstheme="minorBidi" w:eastAsiaTheme="minorHAnsi"/>
+                <w:sz w:val="16"/>
+                <w:szCs w:val="16"/>
+              </w:rPr>
+              <w:t xml:space="preserve">[    ] </w:t>
+            </w:r>
+            <w:r>
+              <w:rPr>
+                <w:rFonts w:cstheme="minorBidi" w:eastAsiaTheme="minorHAnsi"/>
+                <w:sz w:val="16"/>
+                <w:szCs w:val="16"/>
+              </w:rPr>
+              <w:t>8.32 Consórcio</w:t>
+            </w:r>
+          </w:p>
+          <w:p>
+            <w:pPr>
+              <w:pStyle w:val="Contedodatabela"/>
+              <w:widowControl/>
+              <w:suppressAutoHyphens w:val="true"/>
+              <w:bidi w:val="0"/>
+              <w:spacing w:lineRule="auto" w:line="240" w:before="57" w:after="257"/>
+              <w:jc w:val="left"/>
+              <w:rPr>
+                <w:sz w:val="16"/>
+                <w:szCs w:val="16"/>
+              </w:rPr>
+            </w:pPr>
+            <w:r>
+              <w:rPr>
+                <w:sz w:val="16"/>
+                <w:szCs w:val="16"/>
+              </w:rPr>
+              <w:t>[    ] 8.3</w:t>
+            </w:r>
+            <w:r>
+              <w:rPr>
+                <w:sz w:val="16"/>
+                <w:szCs w:val="16"/>
+              </w:rPr>
+              <w:t>3</w:t>
+            </w:r>
+            <w:r>
+              <w:rPr>
+                <w:sz w:val="16"/>
+                <w:szCs w:val="16"/>
+              </w:rPr>
+              <w:t xml:space="preserve"> C</w:t>
+            </w:r>
+            <w:r>
+              <w:rPr>
+                <w:sz w:val="16"/>
+                <w:szCs w:val="16"/>
+              </w:rPr>
+              <w:t>ooperativa</w:t>
+            </w:r>
+          </w:p>
+          <w:p>
+            <w:pPr>
+              <w:pStyle w:val="Contedodatabela"/>
+              <w:widowControl/>
+              <w:suppressAutoHyphens w:val="true"/>
+              <w:bidi w:val="0"/>
+              <w:spacing w:lineRule="auto" w:line="240" w:before="57" w:after="257"/>
+              <w:jc w:val="left"/>
+              <w:rPr>
+                <w:sz w:val="16"/>
+                <w:szCs w:val="16"/>
+              </w:rPr>
+            </w:pPr>
+            <w:r>
+              <w:rPr>
+                <w:sz w:val="16"/>
+                <w:szCs w:val="16"/>
+              </w:rPr>
+              <w:t xml:space="preserve">[    ] </w:t>
+            </w:r>
+            <w:r>
+              <w:rPr>
+                <w:sz w:val="16"/>
+                <w:szCs w:val="16"/>
+              </w:rPr>
+              <w:t>4.</w:t>
+            </w:r>
+            <w:r>
+              <w:rPr>
+                <w:sz w:val="16"/>
+                <w:szCs w:val="16"/>
+              </w:rPr>
+              <w:t>4 Garantia</w:t>
+            </w:r>
+          </w:p>
+          <w:p>
+            <w:pPr>
+              <w:pStyle w:val="Contedodatabela"/>
+              <w:widowControl/>
+              <w:suppressAutoHyphens w:val="true"/>
+              <w:bidi w:val="0"/>
+              <w:spacing w:lineRule="auto" w:line="240" w:before="57" w:after="257"/>
+              <w:jc w:val="left"/>
+              <w:rPr>
+                <w:sz w:val="16"/>
+                <w:szCs w:val="16"/>
+              </w:rPr>
+            </w:pPr>
+            <w:r>
+              <w:rPr>
+                <w:sz w:val="16"/>
+                <w:szCs w:val="16"/>
+              </w:rPr>
+              <w:t xml:space="preserve">[    ] </w:t>
+            </w:r>
+            <w:r>
+              <w:rPr>
+                <w:sz w:val="16"/>
+                <w:szCs w:val="16"/>
+              </w:rPr>
+              <w:t>4.7 Vistoria</w:t>
+            </w:r>
+          </w:p>
+          <w:p>
+            <w:pPr>
+              <w:pStyle w:val="Contedodatabela"/>
+              <w:widowControl/>
+              <w:suppressAutoHyphens w:val="true"/>
+              <w:bidi w:val="0"/>
+              <w:spacing w:lineRule="auto" w:line="240" w:before="0" w:after="200"/>
+              <w:jc w:val="left"/>
+              <w:rPr>
+                <w:rFonts w:ascii="Calibri" w:hAnsi="Calibri" w:eastAsia="Calibri" w:cs="" w:asciiTheme="minorHAnsi" w:cstheme="minorBidi" w:eastAsiaTheme="minorHAnsi" w:hAnsiTheme="minorHAnsi"/>
+                <w:color w:val="auto"/>
+                <w:kern w:val="0"/>
+                <w:sz w:val="16"/>
+                <w:szCs w:val="22"/>
+                <w:lang w:val="pt-BR" w:eastAsia="en-US" w:bidi="ar-SA"/>
+              </w:rPr>
+            </w:pPr>
+            <w:r>
+              <w:rPr>
+                <w:rFonts w:eastAsia="Calibri" w:cs="" w:cstheme="minorBidi" w:eastAsiaTheme="minorHAnsi"/>
+                <w:color w:val="auto"/>
+                <w:kern w:val="0"/>
+                <w:sz w:val="16"/>
+                <w:szCs w:val="22"/>
+                <w:lang w:val="pt-BR" w:eastAsia="en-US" w:bidi="ar-SA"/>
+              </w:rPr>
+            </w:r>
+          </w:p>
+          <w:p>
+            <w:pPr>
+              <w:pStyle w:val="Contedodatabela"/>
+              <w:widowControl/>
+              <w:suppressAutoHyphens w:val="true"/>
+              <w:bidi w:val="0"/>
+              <w:spacing w:lineRule="auto" w:line="240" w:before="0" w:after="200"/>
+              <w:jc w:val="left"/>
+              <w:rPr>
+                <w:rFonts w:ascii="Calibri" w:hAnsi="Calibri" w:eastAsia="Calibri" w:cs="" w:asciiTheme="minorHAnsi" w:cstheme="minorBidi" w:eastAsiaTheme="minorHAnsi" w:hAnsiTheme="minorHAnsi"/>
+                <w:color w:val="auto"/>
+                <w:kern w:val="0"/>
+                <w:sz w:val="16"/>
+                <w:szCs w:val="22"/>
+                <w:lang w:val="pt-BR" w:eastAsia="en-US" w:bidi="ar-SA"/>
+              </w:rPr>
+            </w:pPr>
+            <w:r>
+              <w:rPr>
+                <w:rFonts w:eastAsia="Calibri" w:cs="" w:cstheme="minorBidi" w:eastAsiaTheme="minorHAnsi"/>
+                <w:color w:val="auto"/>
+                <w:kern w:val="0"/>
+                <w:sz w:val="16"/>
+                <w:szCs w:val="22"/>
+                <w:lang w:val="pt-BR" w:eastAsia="en-US" w:bidi="ar-SA"/>
+              </w:rPr>
+              <w:t>CONTRATO</w:t>
+              <w:br/>
+            </w:r>
+            <w:r>
+              <w:rPr>
+                <w:rFonts w:eastAsia="Calibri" w:cs="" w:cstheme="minorBidi" w:eastAsiaTheme="minorHAnsi"/>
+                <w:color w:val="auto"/>
+                <w:kern w:val="0"/>
+                <w:sz w:val="16"/>
+                <w:szCs w:val="16"/>
+                <w:lang w:val="pt-BR" w:eastAsia="en-US" w:bidi="ar-SA"/>
+              </w:rPr>
+              <w:t>[    ] 7.10.4 Garantia</w:t>
+            </w:r>
+          </w:p>
+        </w:tc>
+        <w:tc>
+          <w:tcPr>
+            <w:tcW w:w="2160" w:type="dxa"/>
             <w:tcBorders>
               <w:top w:val="single" w:sz="8" w:space="0" w:color="000000"/>
               <w:left w:val="single" w:sz="8" w:space="0" w:color="000000"/>
               <w:bottom w:val="single" w:sz="8" w:space="0" w:color="000000"/>
               <w:right w:val="single" w:sz="8" w:space="0" w:color="000000"/>
             </w:tcBorders>
-            <w:vAlign w:val="center"/>
           </w:tcPr>
           <w:p>
             <w:pPr>
@@ -13388,7 +13613,7 @@
               <w:suppressAutoHyphens w:val="true"/>
               <w:bidi w:val="0"/>
               <w:spacing w:lineRule="auto" w:line="240" w:before="0" w:after="200"/>
-              <w:jc w:val="left"/>
+              <w:jc w:val="center"/>
               <w:rPr>
                 <w:rFonts w:ascii="Calibri" w:hAnsi="Calibri" w:eastAsia="Calibri" w:cs="" w:asciiTheme="minorHAnsi" w:cstheme="minorBidi" w:eastAsiaTheme="minorHAnsi" w:hAnsiTheme="minorHAnsi"/>
                 <w:color w:val="auto"/>
@@ -13407,6 +13632,7 @@
                 <w:szCs w:val="22"/>
                 <w:lang w:val="pt-BR" w:eastAsia="en-US" w:bidi="ar-SA"/>
               </w:rPr>
+              <w:t>EDITAL</w:t>
             </w:r>
           </w:p>
           <w:p>
@@ -13415,10 +13641,10 @@
               <w:widowControl/>
               <w:suppressAutoHyphens w:val="true"/>
               <w:bidi w:val="0"/>
-              <w:spacing w:lineRule="auto" w:line="240" w:before="0" w:after="200"/>
-              <w:jc w:val="left"/>
-              <w:rPr>
-                <w:rFonts w:ascii="Calibri" w:hAnsi="Calibri" w:eastAsia="Calibri" w:cs="" w:asciiTheme="minorHAnsi" w:cstheme="minorBidi" w:eastAsiaTheme="minorHAnsi" w:hAnsiTheme="minorHAnsi"/>
+              <w:spacing w:lineRule="auto" w:line="240" w:before="57" w:after="257"/>
+              <w:jc w:val="left"/>
+              <w:rPr>
+                <w:rFonts w:eastAsia="Calibri" w:cs="" w:cstheme="minorBidi" w:eastAsiaTheme="minorHAnsi"/>
                 <w:color w:val="auto"/>
                 <w:kern w:val="0"/>
                 <w:sz w:val="16"/>
@@ -13435,26 +13661,19 @@
                 <w:szCs w:val="22"/>
                 <w:lang w:val="pt-BR" w:eastAsia="en-US" w:bidi="ar-SA"/>
               </w:rPr>
-              <w:t>TR | Edital</w:t>
-            </w:r>
-          </w:p>
-          <w:p>
-            <w:pPr>
-              <w:pStyle w:val="Contedodatabela"/>
-              <w:widowControl/>
-              <w:suppressAutoHyphens w:val="true"/>
-              <w:bidi w:val="0"/>
-              <w:spacing w:lineRule="auto" w:line="240" w:before="0" w:after="200"/>
-              <w:jc w:val="left"/>
-              <w:rPr>
-                <w:rFonts w:ascii="Calibri" w:hAnsi="Calibri" w:eastAsia="Calibri" w:cs="" w:asciiTheme="minorHAnsi" w:cstheme="minorBidi" w:eastAsiaTheme="minorHAnsi" w:hAnsiTheme="minorHAnsi"/>
+              <w:t xml:space="preserve">[    ] 3.7.10  </w:t>
+            </w:r>
+            <w:r>
+              <w:rPr>
+                <w:rFonts w:eastAsia="Calibri" w:cs="" w:cstheme="minorBidi" w:eastAsiaTheme="minorHAnsi"/>
                 <w:color w:val="auto"/>
                 <w:kern w:val="0"/>
                 <w:sz w:val="16"/>
                 <w:szCs w:val="22"/>
                 <w:lang w:val="pt-BR" w:eastAsia="en-US" w:bidi="ar-SA"/>
               </w:rPr>
-            </w:pPr>
+              <w:t xml:space="preserve">3.8.2 </w:t>
+            </w:r>
             <w:r>
               <w:rPr>
                 <w:rFonts w:eastAsia="Calibri" w:cs="" w:cstheme="minorBidi" w:eastAsiaTheme="minorHAnsi"/>
@@ -13464,7 +13683,7 @@
                 <w:szCs w:val="22"/>
                 <w:lang w:val="pt-BR" w:eastAsia="en-US" w:bidi="ar-SA"/>
               </w:rPr>
-              <w:t xml:space="preserve">☐ ☐ </w:t>
+              <w:t>C</w:t>
             </w:r>
             <w:r>
               <w:rPr>
@@ -13475,29 +13694,180 @@
                 <w:szCs w:val="22"/>
                 <w:lang w:val="pt-BR" w:eastAsia="en-US" w:bidi="ar-SA"/>
               </w:rPr>
-              <w:t>Exclusivo</w:t>
+              <w:t xml:space="preserve">onsórcio </w:t>
               <w:br/>
-              <w:t>ME/EPP/MEI</w:t>
+            </w:r>
+            <w:r>
+              <w:rPr>
+                <w:rFonts w:eastAsia="Calibri" w:cs="" w:cstheme="minorBidi" w:eastAsiaTheme="minorHAnsi"/>
+                <w:color w:val="auto"/>
+                <w:kern w:val="0"/>
+                <w:sz w:val="16"/>
+                <w:szCs w:val="22"/>
+                <w:lang w:val="pt-BR" w:eastAsia="en-US" w:bidi="ar-SA"/>
+              </w:rPr>
               <w:br/>
-              <w:br/>
-              <w:t>☐ ☐ Consórcio</w:t>
-              <w:br/>
-              <w:br/>
-              <w:t>☐ ☐ Cooperativa</w:t>
-              <w:br/>
-            </w:r>
-          </w:p>
-        </w:tc>
-        <w:tc>
-          <w:tcPr>
-            <w:tcW w:w="1351" w:type="dxa"/>
+            </w:r>
+            <w:r>
+              <w:rPr>
+                <w:rFonts w:eastAsia="Calibri" w:cs="" w:cstheme="minorBidi" w:eastAsiaTheme="minorHAnsi"/>
+                <w:color w:val="auto"/>
+                <w:kern w:val="0"/>
+                <w:sz w:val="16"/>
+                <w:szCs w:val="22"/>
+                <w:lang w:val="pt-BR" w:eastAsia="en-US" w:bidi="ar-SA"/>
+              </w:rPr>
+              <w:t xml:space="preserve">[   ] 3.8.1 </w:t>
+            </w:r>
+            <w:r>
+              <w:rPr>
+                <w:rFonts w:eastAsia="Calibri" w:cs="" w:cstheme="minorBidi" w:eastAsiaTheme="minorHAnsi"/>
+                <w:color w:val="auto"/>
+                <w:kern w:val="0"/>
+                <w:sz w:val="16"/>
+                <w:szCs w:val="22"/>
+                <w:lang w:val="pt-BR" w:eastAsia="en-US" w:bidi="ar-SA"/>
+              </w:rPr>
+              <w:t>C</w:t>
+            </w:r>
+            <w:r>
+              <w:rPr>
+                <w:rFonts w:eastAsia="Calibri" w:cs="" w:cstheme="minorBidi" w:eastAsiaTheme="minorHAnsi"/>
+                <w:color w:val="auto"/>
+                <w:kern w:val="0"/>
+                <w:sz w:val="16"/>
+                <w:szCs w:val="22"/>
+                <w:lang w:val="pt-BR" w:eastAsia="en-US" w:bidi="ar-SA"/>
+              </w:rPr>
+              <w:t>ooperativa</w:t>
+            </w:r>
+          </w:p>
+          <w:p>
+            <w:pPr>
+              <w:pStyle w:val="Contedodatabela"/>
+              <w:widowControl/>
+              <w:suppressAutoHyphens w:val="true"/>
+              <w:bidi w:val="0"/>
+              <w:spacing w:lineRule="auto" w:line="240" w:before="57" w:after="257"/>
+              <w:jc w:val="left"/>
+              <w:rPr>
+                <w:sz w:val="16"/>
+                <w:szCs w:val="16"/>
+              </w:rPr>
+            </w:pPr>
+            <w:r>
+              <w:rPr>
+                <w:sz w:val="16"/>
+                <w:szCs w:val="16"/>
+              </w:rPr>
+              <w:t xml:space="preserve">[    ] </w:t>
+            </w:r>
+            <w:r>
+              <w:rPr>
+                <w:sz w:val="16"/>
+                <w:szCs w:val="16"/>
+              </w:rPr>
+              <w:t xml:space="preserve">7.10.4 Garantia </w:t>
+            </w:r>
+            <w:r>
+              <w:rPr>
+                <w:sz w:val="16"/>
+                <w:szCs w:val="16"/>
+              </w:rPr>
+              <w:t>Engª</w:t>
+            </w:r>
+            <w:r>
+              <w:rPr>
+                <w:sz w:val="16"/>
+                <w:szCs w:val="16"/>
+              </w:rPr>
+              <w:t xml:space="preserve"> </w:t>
+            </w:r>
+          </w:p>
+          <w:p>
+            <w:pPr>
+              <w:pStyle w:val="Contedodatabela"/>
+              <w:widowControl/>
+              <w:suppressAutoHyphens w:val="true"/>
+              <w:bidi w:val="0"/>
+              <w:spacing w:lineRule="auto" w:line="240" w:before="57" w:after="257"/>
+              <w:jc w:val="left"/>
+              <w:rPr/>
+            </w:pPr>
+            <w:r>
+              <w:rPr>
+                <w:sz w:val="16"/>
+                <w:szCs w:val="16"/>
+              </w:rPr>
+              <w:t xml:space="preserve">[    ] </w:t>
+            </w:r>
+            <w:r>
+              <w:rPr>
+                <w:sz w:val="16"/>
+                <w:szCs w:val="16"/>
+              </w:rPr>
+              <w:t>8.10 Vistoria</w:t>
+            </w:r>
+          </w:p>
+          <w:p>
+            <w:pPr>
+              <w:pStyle w:val="Contedodatabela"/>
+              <w:widowControl/>
+              <w:suppressAutoHyphens w:val="true"/>
+              <w:bidi w:val="0"/>
+              <w:spacing w:lineRule="auto" w:line="240" w:before="57" w:after="257"/>
+              <w:jc w:val="left"/>
+              <w:rPr>
+                <w:sz w:val="16"/>
+                <w:szCs w:val="16"/>
+              </w:rPr>
+            </w:pPr>
+            <w:r>
+              <w:rPr>
+                <w:sz w:val="16"/>
+                <w:szCs w:val="16"/>
+              </w:rPr>
+            </w:r>
+          </w:p>
+          <w:p>
+            <w:pPr>
+              <w:pStyle w:val="Contedodatabela"/>
+              <w:widowControl/>
+              <w:suppressAutoHyphens w:val="true"/>
+              <w:bidi w:val="0"/>
+              <w:spacing w:lineRule="auto" w:line="240" w:before="57" w:after="257"/>
+              <w:jc w:val="left"/>
+              <w:rPr>
+                <w:rFonts w:eastAsia="Calibri" w:cs="" w:cstheme="minorBidi" w:eastAsiaTheme="minorHAnsi"/>
+                <w:color w:val="auto"/>
+                <w:kern w:val="0"/>
+                <w:sz w:val="16"/>
+                <w:szCs w:val="22"/>
+                <w:lang w:val="pt-BR" w:eastAsia="en-US" w:bidi="ar-SA"/>
+              </w:rPr>
+            </w:pPr>
+            <w:r>
+              <w:rPr>
+                <w:rFonts w:eastAsia="Calibri" w:cs="" w:cstheme="minorBidi" w:eastAsiaTheme="minorHAnsi"/>
+                <w:color w:val="auto"/>
+                <w:kern w:val="0"/>
+                <w:sz w:val="16"/>
+                <w:szCs w:val="22"/>
+                <w:lang w:val="pt-BR" w:eastAsia="en-US" w:bidi="ar-SA"/>
+              </w:rPr>
+              <w:t>[   ]  3.5 Exclusivo EPP</w:t>
+            </w:r>
+          </w:p>
+        </w:tc>
+        <w:tc>
+          <w:tcPr>
+            <w:tcW w:w="1350" w:type="dxa"/>
             <w:tcBorders>
               <w:top w:val="single" w:sz="8" w:space="0" w:color="000000"/>
               <w:left w:val="single" w:sz="8" w:space="0" w:color="000000"/>
               <w:bottom w:val="single" w:sz="8" w:space="0" w:color="000000"/>
               <w:right w:val="single" w:sz="8" w:space="0" w:color="000000"/>
             </w:tcBorders>
-            <w:vAlign w:val="center"/>
           </w:tcPr>
           <w:p>
             <w:pPr>
@@ -13712,7 +14082,7 @@
         </w:tc>
         <w:tc>
           <w:tcPr>
-            <w:tcW w:w="2453" w:type="dxa"/>
+            <w:tcW w:w="2183" w:type="dxa"/>
             <w:tcBorders>
               <w:top w:val="single" w:sz="8" w:space="0" w:color="000000"/>
               <w:left w:val="single" w:sz="8" w:space="0" w:color="000000"/>
@@ -14749,25 +15119,7 @@
                 <w:sz w:val="16"/>
                 <w:szCs w:val="16"/>
               </w:rPr>
-              <w:t>{{ item.valor_unitario_previsto</w:t>
-            </w:r>
-            <w:r>
-              <w:rPr>
-                <w:rFonts w:cs="CenturyGothic,Bold"/>
-                <w:bCs/>
-                <w:sz w:val="16"/>
-                <w:szCs w:val="16"/>
-              </w:rPr>
-              <w:t>_brl</w:t>
-            </w:r>
-            <w:r>
-              <w:rPr>
-                <w:rFonts w:cs="CenturyGothic,Bold"/>
-                <w:bCs/>
-                <w:sz w:val="16"/>
-                <w:szCs w:val="16"/>
-              </w:rPr>
-              <w:t xml:space="preserve"> }}</w:t>
+              <w:t>{{ item.valor_unitario_previsto_brl }}</w:t>
             </w:r>
           </w:p>
         </w:tc>
@@ -15025,7 +15377,7 @@
   <w:comment w:id="0" w:author="Kleber" w:date="2024-11-05T10:51:00Z" w:initials="K">
     <w:p>
       <w:pPr>
-        <w:overflowPunct w:val="true"/>
+        <w:overflowPunct w:val="false"/>
         <w:spacing w:lineRule="auto" w:line="240" w:before="0" w:after="0"/>
         <w:rPr/>
       </w:pPr>
@@ -15041,7 +15393,7 @@
     </w:p>
     <w:p>
       <w:pPr>
-        <w:overflowPunct w:val="true"/>
+        <w:overflowPunct w:val="false"/>
         <w:spacing w:lineRule="auto" w:line="240" w:before="0" w:after="0"/>
         <w:rPr/>
       </w:pPr>
@@ -15059,7 +15411,7 @@
   <w:comment w:id="1" w:author="Kleber Nomura" w:date="2025-10-30T09:26:00Z" w:initials="KN">
     <w:p>
       <w:pPr>
-        <w:overflowPunct w:val="true"/>
+        <w:overflowPunct w:val="false"/>
         <w:spacing w:lineRule="auto" w:line="240" w:before="0" w:after="0"/>
         <w:rPr/>
       </w:pPr>
@@ -15077,7 +15429,7 @@
   <w:comment w:id="2" w:author="Kleber" w:date="2024-09-27T09:45:00Z" w:initials="K">
     <w:p>
       <w:pPr>
-        <w:overflowPunct w:val="true"/>
+        <w:overflowPunct w:val="false"/>
         <w:spacing w:lineRule="auto" w:line="240" w:before="0" w:after="0"/>
         <w:rPr/>
       </w:pPr>
@@ -15095,7 +15447,7 @@
   <w:comment w:id="3" w:author="Kleber" w:date="2024-09-13T14:07:00Z" w:initials="K">
     <w:p>
       <w:pPr>
-        <w:overflowPunct w:val="true"/>
+        <w:overflowPunct w:val="false"/>
         <w:spacing w:lineRule="auto" w:line="240" w:before="0" w:after="0"/>
         <w:rPr/>
       </w:pPr>
@@ -15113,7 +15465,7 @@
   <w:comment w:id="4" w:author="Kleber" w:date="2024-08-16T11:43:00Z" w:initials="K">
     <w:p>
       <w:pPr>
-        <w:overflowPunct w:val="true"/>
+        <w:overflowPunct w:val="false"/>
         <w:spacing w:lineRule="auto" w:line="240" w:before="0" w:after="0"/>
         <w:rPr/>
       </w:pPr>
@@ -15131,7 +15483,7 @@
   <w:comment w:id="5" w:author="Kleber" w:date="2024-09-04T11:23:00Z" w:initials="K">
     <w:p>
       <w:pPr>
-        <w:overflowPunct w:val="true"/>
+        <w:overflowPunct w:val="false"/>
         <w:spacing w:lineRule="auto" w:line="240" w:before="0" w:after="0"/>
         <w:rPr/>
       </w:pPr>
@@ -15149,7 +15501,7 @@
   <w:comment w:id="7" w:author="Kleber" w:date="2024-08-22T10:22:00Z" w:initials="K">
     <w:p>
       <w:pPr>
-        <w:overflowPunct w:val="true"/>
+        <w:overflowPunct w:val="false"/>
         <w:spacing w:lineRule="auto" w:line="240" w:before="0" w:after="0"/>
         <w:rPr/>
       </w:pPr>
@@ -15167,7 +15519,7 @@
   <w:comment w:id="6" w:author="Kleber" w:date="2025-06-18T11:05:00Z" w:initials="K">
     <w:p>
       <w:pPr>
-        <w:overflowPunct w:val="true"/>
+        <w:overflowPunct w:val="false"/>
         <w:spacing w:lineRule="auto" w:line="240" w:before="0" w:after="0"/>
         <w:rPr/>
       </w:pPr>

</xml_diff>